<commit_message>
Added 3 models - partially updated manuscript
</commit_message>
<xml_diff>
--- a/manuscript/behavioural_causal_discovery_world_model_LLM_NEJM_AI.docx
+++ b/manuscript/behavioural_causal_discovery_world_model_LLM_NEJM_AI.docx
@@ -1105,440 +1105,8 @@
         <w:spacing w:after="200" w:line="276" w:lineRule="auto"/>
         <w:jc w:val="both"/>
       </w:pPr>
-      <w:proofErr w:type="spellStart"/>
-      <w:r>
-        <w:rPr>
-          <w:b/>
-          <w:bCs/>
-        </w:rPr>
-        <w:t>Results</w:t>
-      </w:r>
-      <w:proofErr w:type="spellEnd"/>
-      <w:r>
-        <w:rPr>
-          <w:b/>
-          <w:bCs/>
-        </w:rPr>
-        <w:t xml:space="preserve">: </w:t>
-      </w:r>
-      <w:r>
-        <w:t xml:space="preserve">Of 55 </w:t>
-      </w:r>
-      <w:proofErr w:type="spellStart"/>
-      <w:r>
-        <w:t>expert</w:t>
-      </w:r>
-      <w:proofErr w:type="spellEnd"/>
-      <w:r>
-        <w:t xml:space="preserve">-consensus </w:t>
-      </w:r>
-      <w:proofErr w:type="spellStart"/>
-      <w:r>
-        <w:t>causal</w:t>
-      </w:r>
-      <w:proofErr w:type="spellEnd"/>
-      <w:r>
-        <w:t xml:space="preserve"> </w:t>
-      </w:r>
-      <w:proofErr w:type="spellStart"/>
-      <w:r>
-        <w:t>edges</w:t>
-      </w:r>
-      <w:proofErr w:type="spellEnd"/>
-      <w:r>
-        <w:t xml:space="preserve">, Kimi K2.5 </w:t>
-      </w:r>
-      <w:proofErr w:type="spellStart"/>
-      <w:r>
-        <w:t>recovered</w:t>
-      </w:r>
-      <w:proofErr w:type="spellEnd"/>
-      <w:r>
-        <w:t xml:space="preserve"> 22 (40.0% soft recall) with 81.8% </w:t>
-      </w:r>
-      <w:proofErr w:type="spellStart"/>
-      <w:r>
-        <w:t>direction</w:t>
-      </w:r>
-      <w:proofErr w:type="spellEnd"/>
-      <w:r>
-        <w:t xml:space="preserve"> </w:t>
-      </w:r>
-      <w:proofErr w:type="spellStart"/>
-      <w:r>
-        <w:t>accuracy</w:t>
-      </w:r>
-      <w:proofErr w:type="spellEnd"/>
-      <w:r>
-        <w:t xml:space="preserve"> and a </w:t>
-      </w:r>
-      <w:proofErr w:type="spellStart"/>
-      <w:r>
-        <w:t>Structural</w:t>
-      </w:r>
-      <w:proofErr w:type="spellEnd"/>
-      <w:r>
-        <w:t xml:space="preserve"> </w:t>
-      </w:r>
-      <w:proofErr w:type="spellStart"/>
-      <w:r>
-        <w:t>Intervention</w:t>
-      </w:r>
-      <w:proofErr w:type="spellEnd"/>
-      <w:r>
-        <w:t xml:space="preserve"> </w:t>
-      </w:r>
-      <w:proofErr w:type="spellStart"/>
-      <w:r>
-        <w:t>Distance</w:t>
-      </w:r>
-      <w:proofErr w:type="spellEnd"/>
-      <w:r>
-        <w:t xml:space="preserve"> of 22.2% (34/153 </w:t>
-      </w:r>
-      <w:proofErr w:type="spellStart"/>
-      <w:r>
-        <w:t>predictions</w:t>
-      </w:r>
-      <w:proofErr w:type="spellEnd"/>
-      <w:r>
-        <w:t xml:space="preserve"> </w:t>
-      </w:r>
-      <w:proofErr w:type="spellStart"/>
-      <w:r>
-        <w:t>wrong</w:t>
-      </w:r>
-      <w:proofErr w:type="spellEnd"/>
-      <w:r>
-        <w:t xml:space="preserve">), </w:t>
-      </w:r>
-      <w:proofErr w:type="spellStart"/>
-      <w:r>
-        <w:t>while</w:t>
-      </w:r>
-      <w:proofErr w:type="spellEnd"/>
-      <w:r>
-        <w:t xml:space="preserve"> </w:t>
-      </w:r>
-      <w:proofErr w:type="spellStart"/>
-      <w:r>
-        <w:t>Llama</w:t>
-      </w:r>
-      <w:proofErr w:type="spellEnd"/>
-      <w:r>
-        <w:t xml:space="preserve"> 3.1-8B </w:t>
-      </w:r>
-      <w:proofErr w:type="spellStart"/>
-      <w:r>
-        <w:t>recovered</w:t>
-      </w:r>
-      <w:proofErr w:type="spellEnd"/>
-      <w:r>
-        <w:t xml:space="preserve"> </w:t>
-      </w:r>
-      <w:proofErr w:type="spellStart"/>
-      <w:r>
-        <w:t>only</w:t>
-      </w:r>
-      <w:proofErr w:type="spellEnd"/>
-      <w:r>
-        <w:t xml:space="preserve"> 4 (7.3%) with 25.0% </w:t>
-      </w:r>
-      <w:proofErr w:type="spellStart"/>
-      <w:r>
-        <w:t>direction</w:t>
-      </w:r>
-      <w:proofErr w:type="spellEnd"/>
-      <w:r>
-        <w:t xml:space="preserve"> </w:t>
-      </w:r>
-      <w:proofErr w:type="spellStart"/>
-      <w:r>
-        <w:t>accuracy</w:t>
-      </w:r>
-      <w:proofErr w:type="spellEnd"/>
-      <w:r>
-        <w:t xml:space="preserve"> and SID of 28.6% (44/154 </w:t>
-      </w:r>
-      <w:proofErr w:type="spellStart"/>
-      <w:r>
-        <w:t>wrong</w:t>
-      </w:r>
-      <w:proofErr w:type="spellEnd"/>
-      <w:r>
-        <w:t xml:space="preserve">). </w:t>
-      </w:r>
-      <w:proofErr w:type="spellStart"/>
-      <w:r>
-        <w:t>Kimi’s</w:t>
-      </w:r>
-      <w:proofErr w:type="spellEnd"/>
-      <w:r>
-        <w:t xml:space="preserve"> </w:t>
-      </w:r>
-      <w:proofErr w:type="spellStart"/>
-      <w:r>
-        <w:t>signal</w:t>
-      </w:r>
-      <w:proofErr w:type="spellEnd"/>
-      <w:r>
-        <w:t>-to-</w:t>
-      </w:r>
-      <w:proofErr w:type="spellStart"/>
-      <w:r>
-        <w:t>noise</w:t>
-      </w:r>
-      <w:proofErr w:type="spellEnd"/>
-      <w:r>
-        <w:t xml:space="preserve"> ratio (SNR) of 2.16 </w:t>
-      </w:r>
-      <w:proofErr w:type="spellStart"/>
-      <w:r>
-        <w:t>confirmed</w:t>
-      </w:r>
-      <w:proofErr w:type="spellEnd"/>
-      <w:r>
-        <w:t xml:space="preserve"> </w:t>
-      </w:r>
-      <w:proofErr w:type="spellStart"/>
-      <w:r>
-        <w:t>meaningful</w:t>
-      </w:r>
-      <w:proofErr w:type="spellEnd"/>
-      <w:r>
-        <w:t xml:space="preserve"> </w:t>
-      </w:r>
-      <w:proofErr w:type="spellStart"/>
-      <w:r>
-        <w:t>discrimination</w:t>
-      </w:r>
-      <w:proofErr w:type="spellEnd"/>
-      <w:r>
-        <w:t xml:space="preserve"> </w:t>
-      </w:r>
-      <w:proofErr w:type="spellStart"/>
-      <w:r>
-        <w:t>between</w:t>
-      </w:r>
-      <w:proofErr w:type="spellEnd"/>
-      <w:r>
-        <w:t xml:space="preserve"> </w:t>
-      </w:r>
-      <w:proofErr w:type="spellStart"/>
-      <w:r>
-        <w:t>causal</w:t>
-      </w:r>
-      <w:proofErr w:type="spellEnd"/>
-      <w:r>
-        <w:t xml:space="preserve"> and </w:t>
-      </w:r>
-      <w:proofErr w:type="spellStart"/>
-      <w:r>
-        <w:t>irrelevant</w:t>
-      </w:r>
-      <w:proofErr w:type="spellEnd"/>
-      <w:r>
-        <w:t xml:space="preserve"> </w:t>
-      </w:r>
-      <w:proofErr w:type="spellStart"/>
-      <w:r>
-        <w:t>perturbations</w:t>
-      </w:r>
-      <w:proofErr w:type="spellEnd"/>
-      <w:r>
-        <w:t xml:space="preserve">, </w:t>
-      </w:r>
-      <w:proofErr w:type="spellStart"/>
-      <w:r>
-        <w:t>whereas</w:t>
-      </w:r>
-      <w:proofErr w:type="spellEnd"/>
-      <w:r>
-        <w:t xml:space="preserve"> </w:t>
-      </w:r>
-      <w:proofErr w:type="spellStart"/>
-      <w:r>
-        <w:t>Llama’s</w:t>
-      </w:r>
-      <w:proofErr w:type="spellEnd"/>
-      <w:r>
-        <w:t xml:space="preserve"> </w:t>
-      </w:r>
-      <w:proofErr w:type="spellStart"/>
-      <w:r>
-        <w:t>pathological</w:t>
-      </w:r>
-      <w:proofErr w:type="spellEnd"/>
-      <w:r>
-        <w:t xml:space="preserve"> SNR of 0.46 </w:t>
-      </w:r>
-      <w:proofErr w:type="spellStart"/>
-      <w:r>
-        <w:t>indicated</w:t>
-      </w:r>
-      <w:proofErr w:type="spellEnd"/>
-      <w:r>
-        <w:t xml:space="preserve"> </w:t>
-      </w:r>
-      <w:proofErr w:type="spellStart"/>
-      <w:r>
-        <w:t>that</w:t>
-      </w:r>
-      <w:proofErr w:type="spellEnd"/>
-      <w:r>
-        <w:t xml:space="preserve"> </w:t>
-      </w:r>
-      <w:proofErr w:type="spellStart"/>
-      <w:r>
-        <w:t>it</w:t>
-      </w:r>
-      <w:proofErr w:type="spellEnd"/>
-      <w:r>
-        <w:t xml:space="preserve"> </w:t>
-      </w:r>
-      <w:proofErr w:type="spellStart"/>
-      <w:r>
-        <w:t>responded</w:t>
-      </w:r>
-      <w:proofErr w:type="spellEnd"/>
-      <w:r>
-        <w:t xml:space="preserve"> more </w:t>
-      </w:r>
-      <w:proofErr w:type="spellStart"/>
-      <w:r>
-        <w:t>strongly</w:t>
-      </w:r>
-      <w:proofErr w:type="spellEnd"/>
-      <w:r>
-        <w:t xml:space="preserve"> to </w:t>
-      </w:r>
-      <w:proofErr w:type="spellStart"/>
-      <w:r>
-        <w:t>clinically</w:t>
-      </w:r>
-      <w:proofErr w:type="spellEnd"/>
-      <w:r>
-        <w:t xml:space="preserve"> </w:t>
-      </w:r>
-      <w:proofErr w:type="spellStart"/>
-      <w:r>
-        <w:t>irrelevant</w:t>
-      </w:r>
-      <w:proofErr w:type="spellEnd"/>
-      <w:r>
-        <w:t xml:space="preserve"> </w:t>
-      </w:r>
-      <w:proofErr w:type="spellStart"/>
-      <w:r>
-        <w:t>modifications</w:t>
-      </w:r>
-      <w:proofErr w:type="spellEnd"/>
-      <w:r>
-        <w:t xml:space="preserve"> </w:t>
-      </w:r>
-      <w:proofErr w:type="spellStart"/>
-      <w:r>
-        <w:t>than</w:t>
-      </w:r>
-      <w:proofErr w:type="spellEnd"/>
-      <w:r>
-        <w:t xml:space="preserve"> to </w:t>
-      </w:r>
-      <w:proofErr w:type="spellStart"/>
-      <w:r>
-        <w:t>causally</w:t>
-      </w:r>
-      <w:proofErr w:type="spellEnd"/>
-      <w:r>
-        <w:t xml:space="preserve"> </w:t>
-      </w:r>
-      <w:proofErr w:type="spellStart"/>
-      <w:r>
-        <w:t>meaningful</w:t>
-      </w:r>
-      <w:proofErr w:type="spellEnd"/>
-      <w:r>
-        <w:t xml:space="preserve"> </w:t>
-      </w:r>
-      <w:proofErr w:type="spellStart"/>
-      <w:r>
-        <w:t>ones</w:t>
-      </w:r>
-      <w:proofErr w:type="spellEnd"/>
-      <w:r>
-        <w:t xml:space="preserve">, with 0% </w:t>
-      </w:r>
-      <w:proofErr w:type="spellStart"/>
-      <w:r>
-        <w:t>detection</w:t>
-      </w:r>
-      <w:proofErr w:type="spellEnd"/>
-      <w:r>
-        <w:t xml:space="preserve"> power. Kimi </w:t>
-      </w:r>
-      <w:proofErr w:type="spellStart"/>
-      <w:r>
-        <w:t>demonstrated</w:t>
-      </w:r>
-      <w:proofErr w:type="spellEnd"/>
-      <w:r>
-        <w:t xml:space="preserve"> a </w:t>
-      </w:r>
-      <w:proofErr w:type="spellStart"/>
-      <w:r>
-        <w:t>partial</w:t>
-      </w:r>
-      <w:proofErr w:type="spellEnd"/>
-      <w:r>
-        <w:t xml:space="preserve"> </w:t>
-      </w:r>
-      <w:proofErr w:type="spellStart"/>
-      <w:r>
-        <w:t>but</w:t>
-      </w:r>
-      <w:proofErr w:type="spellEnd"/>
-      <w:r>
-        <w:t xml:space="preserve"> incomplete world model; </w:t>
-      </w:r>
-      <w:proofErr w:type="spellStart"/>
-      <w:r>
-        <w:t>Llama</w:t>
-      </w:r>
-      <w:proofErr w:type="spellEnd"/>
-      <w:r>
-        <w:t xml:space="preserve"> </w:t>
-      </w:r>
-      <w:proofErr w:type="spellStart"/>
-      <w:r>
-        <w:t>demonstrated</w:t>
-      </w:r>
-      <w:proofErr w:type="spellEnd"/>
-      <w:r>
-        <w:t xml:space="preserve"> no </w:t>
-      </w:r>
-      <w:proofErr w:type="spellStart"/>
-      <w:r>
-        <w:t>coherent</w:t>
-      </w:r>
-      <w:proofErr w:type="spellEnd"/>
-      <w:r>
-        <w:t xml:space="preserve"> </w:t>
-      </w:r>
-      <w:proofErr w:type="spellStart"/>
-      <w:r>
-        <w:t>causal</w:t>
-      </w:r>
-      <w:proofErr w:type="spellEnd"/>
-      <w:r>
-        <w:t xml:space="preserve"> </w:t>
-      </w:r>
-      <w:proofErr w:type="spellStart"/>
-      <w:r>
-        <w:t>representation</w:t>
-      </w:r>
-      <w:proofErr w:type="spellEnd"/>
-      <w:r>
-        <w:t>.</w:t>
+      <w:r>
+        <w:t>Results: Of 55 expert-consensus causal edges, Kimi K2.5 recovered 41 (74.5% soft recall) with 70.0% direction accuracy and a Structural Intervention Distance of 22.4% (37/165 predictions wrong), while Llama 3.1-8B recovered only 4 (7.3%) with 100.0% direction accuracy and SID of 28.6% (44/154 wrong). Kimi’s signal-to-noise ratio (SNR) of 2.95 confirmed substantially improved discrimination between causal and irrelevant perturbations, with 28.5% detection power, whereas Llama’s pathological SNR of 0.46 indicated that it responded more strongly to clinically irrelevant modifications than to causally meaningful ones, with 0.0% detection power. Kimi demonstrated a partial but incomplete world model; Llama demonstrated no coherent causal representation.</w:t>
       </w:r>
     </w:p>
     <w:p>
@@ -16749,395 +16317,7 @@
         <w:jc w:val="both"/>
       </w:pPr>
       <w:r>
-        <w:t>Of 55 consensus-</w:t>
-      </w:r>
-      <w:proofErr w:type="spellStart"/>
-      <w:r>
-        <w:t>derived</w:t>
-      </w:r>
-      <w:proofErr w:type="spellEnd"/>
-      <w:r>
-        <w:t xml:space="preserve"> </w:t>
-      </w:r>
-      <w:proofErr w:type="spellStart"/>
-      <w:r>
-        <w:t>causal</w:t>
-      </w:r>
-      <w:proofErr w:type="spellEnd"/>
-      <w:r>
-        <w:t xml:space="preserve"> </w:t>
-      </w:r>
-      <w:proofErr w:type="spellStart"/>
-      <w:r>
-        <w:t>edges</w:t>
-      </w:r>
-      <w:proofErr w:type="spellEnd"/>
-      <w:r>
-        <w:t xml:space="preserve">, Kimi K2.5 </w:t>
-      </w:r>
-      <w:proofErr w:type="spellStart"/>
-      <w:r>
-        <w:t>recovered</w:t>
-      </w:r>
-      <w:proofErr w:type="spellEnd"/>
-      <w:r>
-        <w:t xml:space="preserve"> 22 </w:t>
-      </w:r>
-      <w:proofErr w:type="spellStart"/>
-      <w:r>
-        <w:t>at</w:t>
-      </w:r>
-      <w:proofErr w:type="spellEnd"/>
-      <w:r>
-        <w:t xml:space="preserve"> the soft </w:t>
-      </w:r>
-      <w:proofErr w:type="spellStart"/>
-      <w:r>
-        <w:t>detection</w:t>
-      </w:r>
-      <w:proofErr w:type="spellEnd"/>
-      <w:r>
-        <w:t xml:space="preserve"> </w:t>
-      </w:r>
-      <w:proofErr w:type="spellStart"/>
-      <w:r>
-        <w:t>threshold</w:t>
-      </w:r>
-      <w:proofErr w:type="spellEnd"/>
-      <w:r>
-        <w:t xml:space="preserve"> (40.0% soft recall) with 81.8% </w:t>
-      </w:r>
-      <w:proofErr w:type="spellStart"/>
-      <w:r>
-        <w:t>direction</w:t>
-      </w:r>
-      <w:proofErr w:type="spellEnd"/>
-      <w:r>
-        <w:t xml:space="preserve"> </w:t>
-      </w:r>
-      <w:proofErr w:type="spellStart"/>
-      <w:r>
-        <w:t>accuracy</w:t>
-      </w:r>
-      <w:proofErr w:type="spellEnd"/>
-      <w:r>
-        <w:t xml:space="preserve"> (18 of 22 </w:t>
-      </w:r>
-      <w:proofErr w:type="spellStart"/>
-      <w:r>
-        <w:t>detected</w:t>
-      </w:r>
-      <w:proofErr w:type="spellEnd"/>
-      <w:r>
-        <w:t xml:space="preserve"> </w:t>
-      </w:r>
-      <w:proofErr w:type="spellStart"/>
-      <w:r>
-        <w:t>edges</w:t>
-      </w:r>
-      <w:proofErr w:type="spellEnd"/>
-      <w:r>
-        <w:t xml:space="preserve"> </w:t>
-      </w:r>
-      <w:proofErr w:type="spellStart"/>
-      <w:r>
-        <w:t>had</w:t>
-      </w:r>
-      <w:proofErr w:type="spellEnd"/>
-      <w:r>
-        <w:t xml:space="preserve"> the </w:t>
-      </w:r>
-      <w:proofErr w:type="spellStart"/>
-      <w:r>
-        <w:t>correct</w:t>
-      </w:r>
-      <w:proofErr w:type="spellEnd"/>
-      <w:r>
-        <w:t xml:space="preserve"> </w:t>
-      </w:r>
-      <w:proofErr w:type="spellStart"/>
-      <w:r>
-        <w:t>causal</w:t>
-      </w:r>
-      <w:proofErr w:type="spellEnd"/>
-      <w:r>
-        <w:t xml:space="preserve"> </w:t>
-      </w:r>
-      <w:proofErr w:type="spellStart"/>
-      <w:r>
-        <w:t>sign</w:t>
-      </w:r>
-      <w:proofErr w:type="spellEnd"/>
-      <w:r>
-        <w:t xml:space="preserve">). </w:t>
-      </w:r>
-      <w:proofErr w:type="spellStart"/>
-      <w:r>
-        <w:t>Its</w:t>
-      </w:r>
-      <w:proofErr w:type="spellEnd"/>
-      <w:r>
-        <w:t xml:space="preserve"> SID </w:t>
-      </w:r>
-      <w:proofErr w:type="spellStart"/>
-      <w:r>
-        <w:t>was</w:t>
-      </w:r>
-      <w:proofErr w:type="spellEnd"/>
-      <w:r>
-        <w:t xml:space="preserve"> 34 of 153 </w:t>
-      </w:r>
-      <w:proofErr w:type="spellStart"/>
-      <w:r>
-        <w:t>tested</w:t>
-      </w:r>
-      <w:proofErr w:type="spellEnd"/>
-      <w:r>
-        <w:t xml:space="preserve"> </w:t>
-      </w:r>
-      <w:proofErr w:type="spellStart"/>
-      <w:r>
-        <w:t>intervention</w:t>
-      </w:r>
-      <w:proofErr w:type="spellEnd"/>
-      <w:r>
-        <w:t xml:space="preserve">–treatment </w:t>
-      </w:r>
-      <w:proofErr w:type="spellStart"/>
-      <w:r>
-        <w:t>pairs</w:t>
-      </w:r>
-      <w:proofErr w:type="spellEnd"/>
-      <w:r>
-        <w:t xml:space="preserve"> (22.2% </w:t>
-      </w:r>
-      <w:proofErr w:type="spellStart"/>
-      <w:r>
-        <w:t>wrong</w:t>
-      </w:r>
-      <w:proofErr w:type="spellEnd"/>
-      <w:r>
-        <w:t xml:space="preserve">), </w:t>
-      </w:r>
-      <w:proofErr w:type="spellStart"/>
-      <w:r>
-        <w:t>predominantly</w:t>
-      </w:r>
-      <w:proofErr w:type="spellEnd"/>
-      <w:r>
-        <w:t xml:space="preserve"> </w:t>
-      </w:r>
-      <w:r>
-        <w:lastRenderedPageBreak/>
-        <w:t xml:space="preserve">due to </w:t>
-      </w:r>
-      <w:proofErr w:type="spellStart"/>
-      <w:r>
-        <w:t>failure</w:t>
-      </w:r>
-      <w:proofErr w:type="spellEnd"/>
-      <w:r>
-        <w:t xml:space="preserve"> to shift </w:t>
-      </w:r>
-      <w:proofErr w:type="spellStart"/>
-      <w:r>
-        <w:t>when</w:t>
-      </w:r>
-      <w:proofErr w:type="spellEnd"/>
-      <w:r>
-        <w:t xml:space="preserve"> </w:t>
-      </w:r>
-      <w:proofErr w:type="spellStart"/>
-      <w:r>
-        <w:t>experts</w:t>
-      </w:r>
-      <w:proofErr w:type="spellEnd"/>
-      <w:r>
-        <w:t xml:space="preserve"> </w:t>
-      </w:r>
-      <w:proofErr w:type="spellStart"/>
-      <w:r>
-        <w:t>predicted</w:t>
-      </w:r>
-      <w:proofErr w:type="spellEnd"/>
-      <w:r>
-        <w:t xml:space="preserve"> a shift (</w:t>
-      </w:r>
-      <w:proofErr w:type="spellStart"/>
-      <w:r>
-        <w:t>no_shift_when_expected</w:t>
-      </w:r>
-      <w:proofErr w:type="spellEnd"/>
-      <w:r>
-        <w:t xml:space="preserve">: 28 </w:t>
-      </w:r>
-      <w:proofErr w:type="spellStart"/>
-      <w:r>
-        <w:t>cases</w:t>
-      </w:r>
-      <w:proofErr w:type="spellEnd"/>
-      <w:r>
-        <w:t xml:space="preserve">) and </w:t>
-      </w:r>
-      <w:proofErr w:type="spellStart"/>
-      <w:r>
-        <w:t>wrong-direction</w:t>
-      </w:r>
-      <w:proofErr w:type="spellEnd"/>
-      <w:r>
-        <w:t xml:space="preserve"> shifts (3 </w:t>
-      </w:r>
-      <w:proofErr w:type="spellStart"/>
-      <w:r>
-        <w:t>cases</w:t>
-      </w:r>
-      <w:proofErr w:type="spellEnd"/>
-      <w:r>
-        <w:t xml:space="preserve">). </w:t>
-      </w:r>
-      <w:proofErr w:type="spellStart"/>
-      <w:r>
-        <w:t>Llama</w:t>
-      </w:r>
-      <w:proofErr w:type="spellEnd"/>
-      <w:r>
-        <w:t xml:space="preserve"> 3.1-8B </w:t>
-      </w:r>
-      <w:proofErr w:type="spellStart"/>
-      <w:r>
-        <w:t>recovered</w:t>
-      </w:r>
-      <w:proofErr w:type="spellEnd"/>
-      <w:r>
-        <w:t xml:space="preserve"> </w:t>
-      </w:r>
-      <w:proofErr w:type="spellStart"/>
-      <w:r>
-        <w:t>only</w:t>
-      </w:r>
-      <w:proofErr w:type="spellEnd"/>
-      <w:r>
-        <w:t xml:space="preserve"> 4 </w:t>
-      </w:r>
-      <w:proofErr w:type="spellStart"/>
-      <w:r>
-        <w:t>edges</w:t>
-      </w:r>
-      <w:proofErr w:type="spellEnd"/>
-      <w:r>
-        <w:t xml:space="preserve"> (7.3% soft recall), 1 </w:t>
-      </w:r>
-      <w:proofErr w:type="spellStart"/>
-      <w:r>
-        <w:t>at</w:t>
-      </w:r>
-      <w:proofErr w:type="spellEnd"/>
-      <w:r>
-        <w:t xml:space="preserve"> the hard </w:t>
-      </w:r>
-      <w:proofErr w:type="spellStart"/>
-      <w:r>
-        <w:t>threshold</w:t>
-      </w:r>
-      <w:proofErr w:type="spellEnd"/>
-      <w:r>
-        <w:t>. Of the 4 soft-</w:t>
-      </w:r>
-      <w:proofErr w:type="spellStart"/>
-      <w:r>
-        <w:t>detected</w:t>
-      </w:r>
-      <w:proofErr w:type="spellEnd"/>
-      <w:r>
-        <w:t xml:space="preserve"> </w:t>
-      </w:r>
-      <w:proofErr w:type="spellStart"/>
-      <w:r>
-        <w:t>edges</w:t>
-      </w:r>
-      <w:proofErr w:type="spellEnd"/>
-      <w:r>
-        <w:t xml:space="preserve">, </w:t>
-      </w:r>
-      <w:proofErr w:type="spellStart"/>
-      <w:r>
-        <w:t>only</w:t>
-      </w:r>
-      <w:proofErr w:type="spellEnd"/>
-      <w:r>
-        <w:t xml:space="preserve"> 1 </w:t>
-      </w:r>
-      <w:proofErr w:type="spellStart"/>
-      <w:r>
-        <w:t>had</w:t>
-      </w:r>
-      <w:proofErr w:type="spellEnd"/>
-      <w:r>
-        <w:t xml:space="preserve"> the </w:t>
-      </w:r>
-      <w:proofErr w:type="spellStart"/>
-      <w:r>
-        <w:t>correct</w:t>
-      </w:r>
-      <w:proofErr w:type="spellEnd"/>
-      <w:r>
-        <w:t xml:space="preserve"> </w:t>
-      </w:r>
-      <w:proofErr w:type="spellStart"/>
-      <w:r>
-        <w:t>direction</w:t>
-      </w:r>
-      <w:proofErr w:type="spellEnd"/>
-      <w:r>
-        <w:t xml:space="preserve"> (25.0% </w:t>
-      </w:r>
-      <w:proofErr w:type="spellStart"/>
-      <w:r>
-        <w:t>direction</w:t>
-      </w:r>
-      <w:proofErr w:type="spellEnd"/>
-      <w:r>
-        <w:t xml:space="preserve"> </w:t>
-      </w:r>
-      <w:proofErr w:type="spellStart"/>
-      <w:r>
-        <w:t>accuracy</w:t>
-      </w:r>
-      <w:proofErr w:type="spellEnd"/>
-      <w:r>
-        <w:t xml:space="preserve">). </w:t>
-      </w:r>
-      <w:proofErr w:type="spellStart"/>
-      <w:r>
-        <w:t>Its</w:t>
-      </w:r>
-      <w:proofErr w:type="spellEnd"/>
-      <w:r>
-        <w:t xml:space="preserve"> SID </w:t>
-      </w:r>
-      <w:proofErr w:type="spellStart"/>
-      <w:r>
-        <w:t>was</w:t>
-      </w:r>
-      <w:proofErr w:type="spellEnd"/>
-      <w:r>
-        <w:t xml:space="preserve"> 44 of 154 </w:t>
-      </w:r>
-      <w:proofErr w:type="spellStart"/>
-      <w:r>
-        <w:t>pairs</w:t>
-      </w:r>
-      <w:proofErr w:type="spellEnd"/>
-      <w:r>
-        <w:t xml:space="preserve"> (28.6% </w:t>
-      </w:r>
-      <w:proofErr w:type="spellStart"/>
-      <w:r>
-        <w:t>wrong</w:t>
-      </w:r>
-      <w:proofErr w:type="spellEnd"/>
-      <w:r>
-        <w:t>).</w:t>
+        <w:t>Of 55 consensus-derived causal edges, Kimi K2.5 recovered 41 at the soft detection threshold (74.5% soft recall) and 10 at the hard threshold, with 70.0% direction accuracy. Its SID was 37 of 165 tested intervention–treatment pairs (22.4% wrong), predominantly due to failure to shift when experts predicted a shift and a smaller number of wrong-direction or unexpected-reduction errors. Llama 3.1-8B recovered only 4 edges at the soft threshold and 1 at the hard threshold (7.3% soft recall, 1.8% hard recall). Its direction accuracy on detected edges was 100.0%, but this reflected only a handful of recovered edges; its SID remained 44 of 154 pairs (28.6% wrong).</w:t>
       </w:r>
     </w:p>
     <w:p>
@@ -17776,37 +16956,8 @@
         <w:spacing w:before="200" w:after="40"/>
         <w:jc w:val="both"/>
       </w:pPr>
-      <w:proofErr w:type="spellStart"/>
-      <w:r>
-        <w:rPr>
-          <w:b/>
-          <w:bCs/>
-        </w:rPr>
-        <w:t>Table</w:t>
-      </w:r>
-      <w:proofErr w:type="spellEnd"/>
-      <w:r>
-        <w:rPr>
-          <w:b/>
-          <w:bCs/>
-        </w:rPr>
-        <w:t xml:space="preserve"> 1. Three-</w:t>
-      </w:r>
-      <w:proofErr w:type="spellStart"/>
-      <w:r>
-        <w:rPr>
-          <w:b/>
-          <w:bCs/>
-        </w:rPr>
-        <w:t>Dimensional</w:t>
-      </w:r>
-      <w:proofErr w:type="spellEnd"/>
-      <w:r>
-        <w:rPr>
-          <w:b/>
-          <w:bCs/>
-        </w:rPr>
-        <w:t xml:space="preserve"> World Model Evaluation.</w:t>
+      <w:r>
+        <w:t>Table 1. Three-Dimensional World Model Evaluation. Llama direction accuracy is computed only on the 4 soft-detected edges.</w:t>
       </w:r>
     </w:p>
     <w:tbl>
@@ -18107,15 +17258,8 @@
             </w:tcMar>
           </w:tcPr>
           <w:p>
-            <w:pPr>
-              <w:spacing w:after="40"/>
-            </w:pPr>
             <w:r>
-              <w:rPr>
-                <w:sz w:val="20"/>
-                <w:szCs w:val="20"/>
-              </w:rPr>
-              <w:t>22/55 (40.0%)</w:t>
+              <w:t>41/55 (74.5%)</w:t>
             </w:r>
           </w:p>
         </w:tc>
@@ -18136,14 +17280,7 @@
             </w:tcMar>
           </w:tcPr>
           <w:p>
-            <w:pPr>
-              <w:spacing w:after="40"/>
-            </w:pPr>
             <w:r>
-              <w:rPr>
-                <w:sz w:val="20"/>
-                <w:szCs w:val="20"/>
-              </w:rPr>
               <w:t>4/55 (7.3%)</w:t>
             </w:r>
           </w:p>
@@ -18202,15 +17339,8 @@
             </w:tcMar>
           </w:tcPr>
           <w:p>
-            <w:pPr>
-              <w:spacing w:after="40"/>
-            </w:pPr>
             <w:r>
-              <w:rPr>
-                <w:sz w:val="20"/>
-                <w:szCs w:val="20"/>
-              </w:rPr>
-              <w:t>0/55 (0.0%)</w:t>
+              <w:t>10/55 (18.2%)</w:t>
             </w:r>
           </w:p>
         </w:tc>
@@ -18231,14 +17361,7 @@
             </w:tcMar>
           </w:tcPr>
           <w:p>
-            <w:pPr>
-              <w:spacing w:after="40"/>
-            </w:pPr>
             <w:r>
-              <w:rPr>
-                <w:sz w:val="20"/>
-                <w:szCs w:val="20"/>
-              </w:rPr>
               <w:t>1/55 (1.8%)</w:t>
             </w:r>
           </w:p>
@@ -18408,15 +17531,8 @@
             </w:tcMar>
           </w:tcPr>
           <w:p>
-            <w:pPr>
-              <w:spacing w:after="40"/>
-            </w:pPr>
             <w:r>
-              <w:rPr>
-                <w:sz w:val="20"/>
-                <w:szCs w:val="20"/>
-              </w:rPr>
-              <w:t>81.8% (18/22)</w:t>
+              <w:t>70.0%</w:t>
             </w:r>
           </w:p>
         </w:tc>
@@ -18437,15 +17553,8 @@
             </w:tcMar>
           </w:tcPr>
           <w:p>
-            <w:pPr>
-              <w:spacing w:after="40"/>
-            </w:pPr>
             <w:r>
-              <w:rPr>
-                <w:sz w:val="20"/>
-                <w:szCs w:val="20"/>
-              </w:rPr>
-              <w:t>25.0% (1/4)</w:t>
+              <w:t>100.0%*</w:t>
             </w:r>
           </w:p>
         </w:tc>
@@ -18535,15 +17644,8 @@
             </w:tcMar>
           </w:tcPr>
           <w:p>
-            <w:pPr>
-              <w:spacing w:after="40"/>
-            </w:pPr>
             <w:r>
-              <w:rPr>
-                <w:sz w:val="20"/>
-                <w:szCs w:val="20"/>
-              </w:rPr>
-              <w:t>34/153 (22.2%)</w:t>
+              <w:t>37/165 (22.4%)</w:t>
             </w:r>
           </w:p>
         </w:tc>
@@ -18564,14 +17666,7 @@
             </w:tcMar>
           </w:tcPr>
           <w:p>
-            <w:pPr>
-              <w:spacing w:after="40"/>
-            </w:pPr>
             <w:r>
-              <w:rPr>
-                <w:sz w:val="20"/>
-                <w:szCs w:val="20"/>
-              </w:rPr>
               <w:t>44/154 (28.6%)</w:t>
             </w:r>
           </w:p>
@@ -18748,15 +17843,8 @@
             </w:tcMar>
           </w:tcPr>
           <w:p>
-            <w:pPr>
-              <w:spacing w:after="40"/>
-            </w:pPr>
             <w:r>
-              <w:rPr>
-                <w:sz w:val="20"/>
-                <w:szCs w:val="20"/>
-              </w:rPr>
-              <w:t>2.16</w:t>
+              <w:t>2.95</w:t>
             </w:r>
           </w:p>
         </w:tc>
@@ -18777,14 +17865,7 @@
             </w:tcMar>
           </w:tcPr>
           <w:p>
-            <w:pPr>
-              <w:spacing w:after="40"/>
-            </w:pPr>
             <w:r>
-              <w:rPr>
-                <w:sz w:val="20"/>
-                <w:szCs w:val="20"/>
-              </w:rPr>
               <w:t>0.46</w:t>
             </w:r>
           </w:p>
@@ -18860,15 +17941,8 @@
             </w:tcMar>
           </w:tcPr>
           <w:p>
-            <w:pPr>
-              <w:spacing w:after="40"/>
-            </w:pPr>
             <w:r>
-              <w:rPr>
-                <w:sz w:val="20"/>
-                <w:szCs w:val="20"/>
-              </w:rPr>
-              <w:t>0.227</w:t>
+              <w:t>0.229</w:t>
             </w:r>
           </w:p>
         </w:tc>
@@ -18889,14 +17963,7 @@
             </w:tcMar>
           </w:tcPr>
           <w:p>
-            <w:pPr>
-              <w:spacing w:after="40"/>
-            </w:pPr>
             <w:r>
-              <w:rPr>
-                <w:sz w:val="20"/>
-                <w:szCs w:val="20"/>
-              </w:rPr>
               <w:t>0.043</w:t>
             </w:r>
           </w:p>
@@ -18971,15 +18038,8 @@
             </w:tcMar>
           </w:tcPr>
           <w:p>
-            <w:pPr>
-              <w:spacing w:after="40"/>
-            </w:pPr>
             <w:r>
-              <w:rPr>
-                <w:sz w:val="20"/>
-                <w:szCs w:val="20"/>
-              </w:rPr>
-              <w:t>0.105</w:t>
+              <w:t>0.078</w:t>
             </w:r>
           </w:p>
         </w:tc>
@@ -19000,14 +18060,7 @@
             </w:tcMar>
           </w:tcPr>
           <w:p>
-            <w:pPr>
-              <w:spacing w:after="40"/>
-            </w:pPr>
             <w:r>
-              <w:rPr>
-                <w:sz w:val="20"/>
-                <w:szCs w:val="20"/>
-              </w:rPr>
               <w:t>0.094</w:t>
             </w:r>
           </w:p>
@@ -19082,15 +18135,8 @@
             </w:tcMar>
           </w:tcPr>
           <w:p>
-            <w:pPr>
-              <w:spacing w:after="40"/>
-            </w:pPr>
             <w:r>
-              <w:rPr>
-                <w:sz w:val="20"/>
-                <w:szCs w:val="20"/>
-              </w:rPr>
-              <w:t>15.0%</w:t>
+              <w:t>28.5%</w:t>
             </w:r>
           </w:p>
         </w:tc>
@@ -19111,14 +18157,7 @@
             </w:tcMar>
           </w:tcPr>
           <w:p>
-            <w:pPr>
-              <w:spacing w:after="40"/>
-            </w:pPr>
             <w:r>
-              <w:rPr>
-                <w:sz w:val="20"/>
-                <w:szCs w:val="20"/>
-              </w:rPr>
               <w:t>0.0%</w:t>
             </w:r>
           </w:p>
@@ -19131,21 +18170,8 @@
         <w:spacing w:after="200"/>
       </w:pPr>
       <w:r>
-        <w:t xml:space="preserve">Edge-Level </w:t>
-      </w:r>
-      <w:proofErr w:type="spellStart"/>
-      <w:r>
-        <w:t>Signal</w:t>
-      </w:r>
-      <w:proofErr w:type="spellEnd"/>
-      <w:r>
-        <w:t xml:space="preserve"> </w:t>
-      </w:r>
-      <w:proofErr w:type="spellStart"/>
-      <w:r>
-        <w:t>Strength</w:t>
-      </w:r>
-      <w:proofErr w:type="spellEnd"/>
+        <w:t>Edge-Level Signal Strength</w:t>
+      </w:r>
     </w:p>
     <w:p>
       <w:pPr>
@@ -19153,508 +18179,7 @@
         <w:jc w:val="both"/>
       </w:pPr>
       <w:r>
-        <w:t xml:space="preserve">The </w:t>
-      </w:r>
-      <w:proofErr w:type="spellStart"/>
-      <w:r>
-        <w:t>edge-level</w:t>
-      </w:r>
-      <w:proofErr w:type="spellEnd"/>
-      <w:r>
-        <w:t xml:space="preserve"> JSD </w:t>
-      </w:r>
-      <w:proofErr w:type="spellStart"/>
-      <w:r>
-        <w:t>analysis</w:t>
-      </w:r>
-      <w:proofErr w:type="spellEnd"/>
-      <w:r>
-        <w:t xml:space="preserve"> (Figure 2) </w:t>
-      </w:r>
-      <w:proofErr w:type="spellStart"/>
-      <w:r>
-        <w:t>reveals</w:t>
-      </w:r>
-      <w:proofErr w:type="spellEnd"/>
-      <w:r>
-        <w:t xml:space="preserve"> the </w:t>
-      </w:r>
-      <w:proofErr w:type="spellStart"/>
-      <w:r>
-        <w:t>magnitude</w:t>
-      </w:r>
-      <w:proofErr w:type="spellEnd"/>
-      <w:r>
-        <w:t xml:space="preserve"> of the gap </w:t>
-      </w:r>
-      <w:proofErr w:type="spellStart"/>
-      <w:r>
-        <w:t>between</w:t>
-      </w:r>
-      <w:proofErr w:type="spellEnd"/>
-      <w:r>
-        <w:t xml:space="preserve"> models </w:t>
-      </w:r>
-      <w:proofErr w:type="spellStart"/>
-      <w:r>
-        <w:t>across</w:t>
-      </w:r>
-      <w:proofErr w:type="spellEnd"/>
-      <w:r>
-        <w:t xml:space="preserve"> </w:t>
-      </w:r>
-      <w:proofErr w:type="spellStart"/>
-      <w:r>
-        <w:t>all</w:t>
-      </w:r>
-      <w:proofErr w:type="spellEnd"/>
-      <w:r>
-        <w:t xml:space="preserve"> 55 </w:t>
-      </w:r>
-      <w:proofErr w:type="spellStart"/>
-      <w:r>
-        <w:t>gold</w:t>
-      </w:r>
-      <w:proofErr w:type="spellEnd"/>
-      <w:r>
-        <w:t xml:space="preserve">-standard </w:t>
-      </w:r>
-      <w:proofErr w:type="spellStart"/>
-      <w:r>
-        <w:t>edges</w:t>
-      </w:r>
-      <w:proofErr w:type="spellEnd"/>
-      <w:r>
-        <w:t xml:space="preserve">. Kimi K2.5’s </w:t>
-      </w:r>
-      <w:proofErr w:type="spellStart"/>
-      <w:r>
-        <w:t>mean</w:t>
-      </w:r>
-      <w:proofErr w:type="spellEnd"/>
-      <w:r>
-        <w:t xml:space="preserve"> JSD </w:t>
-      </w:r>
-      <w:proofErr w:type="spellStart"/>
-      <w:r>
-        <w:t>across</w:t>
-      </w:r>
-      <w:proofErr w:type="spellEnd"/>
-      <w:r>
-        <w:t xml:space="preserve"> </w:t>
-      </w:r>
-      <w:proofErr w:type="spellStart"/>
-      <w:r>
-        <w:t>all</w:t>
-      </w:r>
-      <w:proofErr w:type="spellEnd"/>
-      <w:r>
-        <w:t xml:space="preserve"> </w:t>
-      </w:r>
-      <w:proofErr w:type="spellStart"/>
-      <w:r>
-        <w:t>edges</w:t>
-      </w:r>
-      <w:proofErr w:type="spellEnd"/>
-      <w:r>
-        <w:t xml:space="preserve"> </w:t>
-      </w:r>
-      <w:proofErr w:type="spellStart"/>
-      <w:r>
-        <w:t>was</w:t>
-      </w:r>
-      <w:proofErr w:type="spellEnd"/>
-      <w:r>
-        <w:t xml:space="preserve"> 0.254 (</w:t>
-      </w:r>
-      <w:proofErr w:type="spellStart"/>
-      <w:r>
-        <w:t>median</w:t>
-      </w:r>
-      <w:proofErr w:type="spellEnd"/>
-      <w:r>
-        <w:t xml:space="preserve"> 0.258), </w:t>
-      </w:r>
-      <w:proofErr w:type="spellStart"/>
-      <w:r>
-        <w:t>indicating</w:t>
-      </w:r>
-      <w:proofErr w:type="spellEnd"/>
-      <w:r>
-        <w:t xml:space="preserve"> </w:t>
-      </w:r>
-      <w:proofErr w:type="spellStart"/>
-      <w:r>
-        <w:t>consistent</w:t>
-      </w:r>
-      <w:proofErr w:type="spellEnd"/>
-      <w:r>
-        <w:t xml:space="preserve"> moderate-</w:t>
-      </w:r>
-      <w:proofErr w:type="spellStart"/>
-      <w:r>
-        <w:t>strength</w:t>
-      </w:r>
-      <w:proofErr w:type="spellEnd"/>
-      <w:r>
-        <w:t xml:space="preserve"> </w:t>
-      </w:r>
-      <w:proofErr w:type="spellStart"/>
-      <w:r>
-        <w:t>causal</w:t>
-      </w:r>
-      <w:proofErr w:type="spellEnd"/>
-      <w:r>
-        <w:t xml:space="preserve"> </w:t>
-      </w:r>
-      <w:proofErr w:type="spellStart"/>
-      <w:r>
-        <w:t>signals</w:t>
-      </w:r>
-      <w:proofErr w:type="spellEnd"/>
-      <w:r>
-        <w:t xml:space="preserve">, </w:t>
-      </w:r>
-      <w:proofErr w:type="spellStart"/>
-      <w:r>
-        <w:t>whereas</w:t>
-      </w:r>
-      <w:proofErr w:type="spellEnd"/>
-      <w:r>
-        <w:t xml:space="preserve"> </w:t>
-      </w:r>
-      <w:proofErr w:type="spellStart"/>
-      <w:r>
-        <w:t>Llama</w:t>
-      </w:r>
-      <w:proofErr w:type="spellEnd"/>
-      <w:r>
-        <w:t xml:space="preserve"> 3.1-8B’s </w:t>
-      </w:r>
-      <w:proofErr w:type="spellStart"/>
-      <w:r>
-        <w:t>mean</w:t>
-      </w:r>
-      <w:proofErr w:type="spellEnd"/>
-      <w:r>
-        <w:t xml:space="preserve"> JSD </w:t>
-      </w:r>
-      <w:proofErr w:type="spellStart"/>
-      <w:r>
-        <w:t>was</w:t>
-      </w:r>
-      <w:proofErr w:type="spellEnd"/>
-      <w:r>
-        <w:t xml:space="preserve"> 0.045 (</w:t>
-      </w:r>
-      <w:proofErr w:type="spellStart"/>
-      <w:r>
-        <w:t>median</w:t>
-      </w:r>
-      <w:proofErr w:type="spellEnd"/>
-      <w:r>
-        <w:t xml:space="preserve"> </w:t>
-      </w:r>
-      <w:proofErr w:type="gramStart"/>
-      <w:r>
-        <w:t>0.036)—</w:t>
-      </w:r>
-      <w:proofErr w:type="spellStart"/>
-      <w:proofErr w:type="gramEnd"/>
-      <w:r>
-        <w:t>barely</w:t>
-      </w:r>
-      <w:proofErr w:type="spellEnd"/>
-      <w:r>
-        <w:t xml:space="preserve"> </w:t>
-      </w:r>
-      <w:proofErr w:type="spellStart"/>
-      <w:r>
-        <w:t>above</w:t>
-      </w:r>
-      <w:proofErr w:type="spellEnd"/>
-      <w:r>
-        <w:t xml:space="preserve"> the </w:t>
-      </w:r>
-      <w:proofErr w:type="spellStart"/>
-      <w:r>
-        <w:t>noise</w:t>
-      </w:r>
-      <w:proofErr w:type="spellEnd"/>
-      <w:r>
-        <w:t xml:space="preserve"> </w:t>
-      </w:r>
-      <w:proofErr w:type="spellStart"/>
-      <w:r>
-        <w:t>floor</w:t>
-      </w:r>
-      <w:proofErr w:type="spellEnd"/>
-      <w:r>
-        <w:t xml:space="preserve">. The </w:t>
-      </w:r>
-      <w:proofErr w:type="spellStart"/>
-      <w:r>
-        <w:t>difference</w:t>
-      </w:r>
-      <w:proofErr w:type="spellEnd"/>
-      <w:r>
-        <w:t xml:space="preserve"> </w:t>
-      </w:r>
-      <w:proofErr w:type="spellStart"/>
-      <w:r>
-        <w:t>is</w:t>
-      </w:r>
-      <w:proofErr w:type="spellEnd"/>
-      <w:r>
-        <w:t xml:space="preserve"> </w:t>
-      </w:r>
-      <w:proofErr w:type="spellStart"/>
-      <w:r>
-        <w:t>visible</w:t>
-      </w:r>
-      <w:proofErr w:type="spellEnd"/>
-      <w:r>
-        <w:t xml:space="preserve"> </w:t>
-      </w:r>
-      <w:proofErr w:type="spellStart"/>
-      <w:r>
-        <w:t>at</w:t>
-      </w:r>
-      <w:proofErr w:type="spellEnd"/>
-      <w:r>
-        <w:t xml:space="preserve"> </w:t>
-      </w:r>
-      <w:proofErr w:type="spellStart"/>
-      <w:r>
-        <w:t>every</w:t>
-      </w:r>
-      <w:proofErr w:type="spellEnd"/>
-      <w:r>
-        <w:t xml:space="preserve"> </w:t>
-      </w:r>
-      <w:proofErr w:type="spellStart"/>
-      <w:r>
-        <w:t>edge</w:t>
-      </w:r>
-      <w:proofErr w:type="spellEnd"/>
-      <w:r>
-        <w:t xml:space="preserve">: </w:t>
-      </w:r>
-      <w:proofErr w:type="spellStart"/>
-      <w:r>
-        <w:t>even</w:t>
-      </w:r>
-      <w:proofErr w:type="spellEnd"/>
-      <w:r>
-        <w:t xml:space="preserve"> </w:t>
-      </w:r>
-      <w:proofErr w:type="spellStart"/>
-      <w:r>
-        <w:t>Kimi’s</w:t>
-      </w:r>
-      <w:proofErr w:type="spellEnd"/>
-      <w:r>
-        <w:t xml:space="preserve"> </w:t>
-      </w:r>
-      <w:proofErr w:type="spellStart"/>
-      <w:r>
-        <w:t>weakest</w:t>
-      </w:r>
-      <w:proofErr w:type="spellEnd"/>
-      <w:r>
-        <w:t xml:space="preserve"> </w:t>
-      </w:r>
-      <w:proofErr w:type="spellStart"/>
-      <w:r>
-        <w:t>causal</w:t>
-      </w:r>
-      <w:proofErr w:type="spellEnd"/>
-      <w:r>
-        <w:t xml:space="preserve"> </w:t>
-      </w:r>
-      <w:proofErr w:type="spellStart"/>
-      <w:r>
-        <w:t>signals</w:t>
-      </w:r>
-      <w:proofErr w:type="spellEnd"/>
-      <w:r>
-        <w:t xml:space="preserve"> </w:t>
-      </w:r>
-      <w:proofErr w:type="spellStart"/>
-      <w:r>
-        <w:t>generally</w:t>
-      </w:r>
-      <w:proofErr w:type="spellEnd"/>
-      <w:r>
-        <w:t xml:space="preserve"> </w:t>
-      </w:r>
-      <w:proofErr w:type="spellStart"/>
-      <w:r>
-        <w:t>exceed</w:t>
-      </w:r>
-      <w:proofErr w:type="spellEnd"/>
-      <w:r>
-        <w:t xml:space="preserve"> </w:t>
-      </w:r>
-      <w:proofErr w:type="spellStart"/>
-      <w:r>
-        <w:t>Llama’s</w:t>
-      </w:r>
-      <w:proofErr w:type="spellEnd"/>
-      <w:r>
-        <w:t xml:space="preserve"> </w:t>
-      </w:r>
-      <w:proofErr w:type="spellStart"/>
-      <w:r>
-        <w:t>strongest</w:t>
-      </w:r>
-      <w:proofErr w:type="spellEnd"/>
-      <w:r>
-        <w:t xml:space="preserve">. Kimi </w:t>
-      </w:r>
-      <w:proofErr w:type="spellStart"/>
-      <w:r>
-        <w:t>achieved</w:t>
-      </w:r>
-      <w:proofErr w:type="spellEnd"/>
-      <w:r>
-        <w:t xml:space="preserve"> JSD &gt; 0.30 on 17 of 55 </w:t>
-      </w:r>
-      <w:proofErr w:type="spellStart"/>
-      <w:r>
-        <w:t>edges</w:t>
-      </w:r>
-      <w:proofErr w:type="spellEnd"/>
-      <w:r>
-        <w:t xml:space="preserve">, </w:t>
-      </w:r>
-      <w:proofErr w:type="spellStart"/>
-      <w:r>
-        <w:t>compared</w:t>
-      </w:r>
-      <w:proofErr w:type="spellEnd"/>
-      <w:r>
-        <w:t xml:space="preserve"> to 0 for </w:t>
-      </w:r>
-      <w:proofErr w:type="spellStart"/>
-      <w:r>
-        <w:t>Llama</w:t>
-      </w:r>
-      <w:proofErr w:type="spellEnd"/>
-      <w:r>
-        <w:t xml:space="preserve">. The </w:t>
-      </w:r>
-      <w:proofErr w:type="spellStart"/>
-      <w:r>
-        <w:t>grey</w:t>
-      </w:r>
-      <w:proofErr w:type="spellEnd"/>
-      <w:r>
-        <w:t xml:space="preserve"> </w:t>
-      </w:r>
-      <w:proofErr w:type="spellStart"/>
-      <w:r>
-        <w:t>connecting</w:t>
-      </w:r>
-      <w:proofErr w:type="spellEnd"/>
-      <w:r>
-        <w:t xml:space="preserve"> lines </w:t>
-      </w:r>
-      <w:proofErr w:type="spellStart"/>
-      <w:r>
-        <w:t>between</w:t>
-      </w:r>
-      <w:proofErr w:type="spellEnd"/>
-      <w:r>
-        <w:t xml:space="preserve"> dots for the </w:t>
-      </w:r>
-      <w:proofErr w:type="spellStart"/>
-      <w:r>
-        <w:t>same</w:t>
-      </w:r>
-      <w:proofErr w:type="spellEnd"/>
-      <w:r>
-        <w:t xml:space="preserve"> </w:t>
-      </w:r>
-      <w:proofErr w:type="spellStart"/>
-      <w:r>
-        <w:t>edge</w:t>
-      </w:r>
-      <w:proofErr w:type="spellEnd"/>
-      <w:r>
-        <w:t xml:space="preserve"> illustrate </w:t>
-      </w:r>
-      <w:proofErr w:type="spellStart"/>
-      <w:r>
-        <w:t>that</w:t>
-      </w:r>
-      <w:proofErr w:type="spellEnd"/>
-      <w:r>
-        <w:t xml:space="preserve"> the </w:t>
-      </w:r>
-      <w:proofErr w:type="spellStart"/>
-      <w:r>
-        <w:t>between</w:t>
-      </w:r>
-      <w:proofErr w:type="spellEnd"/>
-      <w:r>
-        <w:t xml:space="preserve">-model gap </w:t>
-      </w:r>
-      <w:proofErr w:type="spellStart"/>
-      <w:r>
-        <w:t>is</w:t>
-      </w:r>
-      <w:proofErr w:type="spellEnd"/>
-      <w:r>
-        <w:t xml:space="preserve"> </w:t>
-      </w:r>
-      <w:proofErr w:type="spellStart"/>
-      <w:r>
-        <w:t>systematic</w:t>
-      </w:r>
-      <w:proofErr w:type="spellEnd"/>
-      <w:r>
-        <w:t xml:space="preserve">, </w:t>
-      </w:r>
-      <w:proofErr w:type="spellStart"/>
-      <w:r>
-        <w:t>not</w:t>
-      </w:r>
-      <w:proofErr w:type="spellEnd"/>
-      <w:r>
-        <w:t xml:space="preserve"> </w:t>
-      </w:r>
-      <w:proofErr w:type="spellStart"/>
-      <w:r>
-        <w:t>driven</w:t>
-      </w:r>
-      <w:proofErr w:type="spellEnd"/>
-      <w:r>
-        <w:t xml:space="preserve"> by a </w:t>
-      </w:r>
-      <w:proofErr w:type="spellStart"/>
-      <w:r>
-        <w:t>few</w:t>
-      </w:r>
-      <w:proofErr w:type="spellEnd"/>
-      <w:r>
-        <w:t xml:space="preserve"> </w:t>
-      </w:r>
-      <w:proofErr w:type="spellStart"/>
-      <w:r>
-        <w:t>outlier</w:t>
-      </w:r>
-      <w:proofErr w:type="spellEnd"/>
-      <w:r>
-        <w:t xml:space="preserve"> </w:t>
-      </w:r>
-      <w:proofErr w:type="spellStart"/>
-      <w:r>
-        <w:t>edges</w:t>
-      </w:r>
-      <w:proofErr w:type="spellEnd"/>
-      <w:r>
-        <w:t>.</w:t>
+        <w:t>The edge-level JSD analysis (Figure 2) reveals the magnitude of the gap between models across all 55 gold-standard edges. Kimi K2.5’s mean JSD across all edges was 0.251 (median 0.258), indicating consistent moderate-strength causal signals, whereas Llama 3.1-8B’s mean JSD was 0.045 (median 0.036), barely above the noise floor. The difference is visible at every edge: even Kimi’s weaker causal signals generally exceed Llama’s strongest. Kimi achieved JSD &gt; 0.30 on 17 of 55 edges, compared to 0 for Llama. The grey connecting lines between dots for the same edge illustrate that the between-model gap is systematic, not driven by a few outlier edges.</w:t>
       </w:r>
     </w:p>
     <w:p>
@@ -20406,27 +18931,9 @@
         <w:pStyle w:val="Titolo2"/>
         <w:spacing w:after="200"/>
       </w:pPr>
-      <w:proofErr w:type="spellStart"/>
-      <w:r>
-        <w:t>Discriminability</w:t>
-      </w:r>
-      <w:proofErr w:type="spellEnd"/>
-      <w:r>
-        <w:t xml:space="preserve">: </w:t>
-      </w:r>
-      <w:proofErr w:type="spellStart"/>
-      <w:r>
-        <w:t>Signal</w:t>
-      </w:r>
-      <w:proofErr w:type="spellEnd"/>
-      <w:r>
-        <w:t xml:space="preserve"> versus </w:t>
-      </w:r>
-      <w:proofErr w:type="spellStart"/>
-      <w:r>
-        <w:t>Noise</w:t>
-      </w:r>
-      <w:proofErr w:type="spellEnd"/>
+      <w:r>
+        <w:t>Discriminability: Signal versus Noise</w:t>
+      </w:r>
     </w:p>
     <w:p>
       <w:pPr>
@@ -20690,15 +19197,8 @@
             </w:tcMar>
           </w:tcPr>
           <w:p>
-            <w:pPr>
-              <w:spacing w:after="40"/>
-            </w:pPr>
             <w:r>
-              <w:rPr>
-                <w:sz w:val="20"/>
-                <w:szCs w:val="20"/>
-              </w:rPr>
-              <w:t>0.227</w:t>
+              <w:t>0.229</w:t>
             </w:r>
           </w:p>
         </w:tc>
@@ -20719,14 +19219,7 @@
             </w:tcMar>
           </w:tcPr>
           <w:p>
-            <w:pPr>
-              <w:spacing w:after="40"/>
-            </w:pPr>
             <w:r>
-              <w:rPr>
-                <w:sz w:val="20"/>
-                <w:szCs w:val="20"/>
-              </w:rPr>
               <w:t>0.043</w:t>
             </w:r>
           </w:p>
@@ -20801,15 +19294,8 @@
             </w:tcMar>
           </w:tcPr>
           <w:p>
-            <w:pPr>
-              <w:spacing w:after="40"/>
-            </w:pPr>
             <w:r>
-              <w:rPr>
-                <w:sz w:val="20"/>
-                <w:szCs w:val="20"/>
-              </w:rPr>
-              <w:t>0.105</w:t>
+              <w:t>0.078</w:t>
             </w:r>
           </w:p>
         </w:tc>
@@ -20830,14 +19316,7 @@
             </w:tcMar>
           </w:tcPr>
           <w:p>
-            <w:pPr>
-              <w:spacing w:after="40"/>
-            </w:pPr>
             <w:r>
-              <w:rPr>
-                <w:sz w:val="20"/>
-                <w:szCs w:val="20"/>
-              </w:rPr>
               <w:t>0.094</w:t>
             </w:r>
           </w:p>
@@ -20905,15 +19384,8 @@
             </w:tcMar>
           </w:tcPr>
           <w:p>
-            <w:pPr>
-              <w:spacing w:after="40"/>
-            </w:pPr>
             <w:r>
-              <w:rPr>
-                <w:sz w:val="20"/>
-                <w:szCs w:val="20"/>
-              </w:rPr>
-              <w:t>0.465</w:t>
+              <w:t>0.279</w:t>
             </w:r>
           </w:p>
         </w:tc>
@@ -20934,14 +19406,7 @@
             </w:tcMar>
           </w:tcPr>
           <w:p>
-            <w:pPr>
-              <w:spacing w:after="40"/>
-            </w:pPr>
             <w:r>
-              <w:rPr>
-                <w:sz w:val="20"/>
-                <w:szCs w:val="20"/>
-              </w:rPr>
               <w:t>0.693</w:t>
             </w:r>
           </w:p>
@@ -21033,17 +19498,8 @@
             </w:tcMar>
           </w:tcPr>
           <w:p>
-            <w:pPr>
-              <w:spacing w:after="40"/>
-            </w:pPr>
             <w:r>
-              <w:rPr>
-                <w:b/>
-                <w:bCs/>
-                <w:sz w:val="20"/>
-                <w:szCs w:val="20"/>
-              </w:rPr>
-              <w:t>2.16</w:t>
+              <w:t>2.95</w:t>
             </w:r>
           </w:p>
         </w:tc>
@@ -21064,16 +19520,7 @@
             </w:tcMar>
           </w:tcPr>
           <w:p>
-            <w:pPr>
-              <w:spacing w:after="40"/>
-            </w:pPr>
             <w:r>
-              <w:rPr>
-                <w:b/>
-                <w:bCs/>
-                <w:sz w:val="20"/>
-                <w:szCs w:val="20"/>
-              </w:rPr>
               <w:t>0.46</w:t>
             </w:r>
           </w:p>
@@ -21141,15 +19588,8 @@
             </w:tcMar>
           </w:tcPr>
           <w:p>
-            <w:pPr>
-              <w:spacing w:after="40"/>
-            </w:pPr>
             <w:r>
-              <w:rPr>
-                <w:sz w:val="20"/>
-                <w:szCs w:val="20"/>
-              </w:rPr>
-              <w:t>15.0%</w:t>
+              <w:t>28.5%</w:t>
             </w:r>
           </w:p>
         </w:tc>
@@ -21170,14 +19610,7 @@
             </w:tcMar>
           </w:tcPr>
           <w:p>
-            <w:pPr>
-              <w:spacing w:after="40"/>
-            </w:pPr>
             <w:r>
-              <w:rPr>
-                <w:sz w:val="20"/>
-                <w:szCs w:val="20"/>
-              </w:rPr>
               <w:t>0.0%</w:t>
             </w:r>
           </w:p>
@@ -21189,125 +19622,8 @@
         <w:spacing w:before="60" w:after="200"/>
         <w:jc w:val="both"/>
       </w:pPr>
-      <w:proofErr w:type="spellStart"/>
-      <w:r>
-        <w:rPr>
-          <w:i/>
-          <w:iCs/>
-          <w:sz w:val="20"/>
-          <w:szCs w:val="20"/>
-        </w:rPr>
-        <w:t>Detection</w:t>
-      </w:r>
-      <w:proofErr w:type="spellEnd"/>
-      <w:r>
-        <w:rPr>
-          <w:i/>
-          <w:iCs/>
-          <w:sz w:val="20"/>
-          <w:szCs w:val="20"/>
-        </w:rPr>
-        <w:t xml:space="preserve"> power = </w:t>
-      </w:r>
-      <w:proofErr w:type="spellStart"/>
-      <w:r>
-        <w:rPr>
-          <w:i/>
-          <w:iCs/>
-          <w:sz w:val="20"/>
-          <w:szCs w:val="20"/>
-        </w:rPr>
-        <w:t>fraction</w:t>
-      </w:r>
-      <w:proofErr w:type="spellEnd"/>
-      <w:r>
-        <w:rPr>
-          <w:i/>
-          <w:iCs/>
-          <w:sz w:val="20"/>
-          <w:szCs w:val="20"/>
-        </w:rPr>
-        <w:t xml:space="preserve"> of </w:t>
-      </w:r>
-      <w:proofErr w:type="spellStart"/>
-      <w:r>
-        <w:rPr>
-          <w:i/>
-          <w:iCs/>
-          <w:sz w:val="20"/>
-          <w:szCs w:val="20"/>
-        </w:rPr>
-        <w:t>causal</w:t>
-      </w:r>
-      <w:proofErr w:type="spellEnd"/>
-      <w:r>
-        <w:rPr>
-          <w:i/>
-          <w:iCs/>
-          <w:sz w:val="20"/>
-          <w:szCs w:val="20"/>
-        </w:rPr>
-        <w:t xml:space="preserve"> JSD </w:t>
-      </w:r>
-      <w:proofErr w:type="spellStart"/>
-      <w:r>
-        <w:rPr>
-          <w:i/>
-          <w:iCs/>
-          <w:sz w:val="20"/>
-          <w:szCs w:val="20"/>
-        </w:rPr>
-        <w:t>values</w:t>
-      </w:r>
-      <w:proofErr w:type="spellEnd"/>
-      <w:r>
-        <w:rPr>
-          <w:i/>
-          <w:iCs/>
-          <w:sz w:val="20"/>
-          <w:szCs w:val="20"/>
-        </w:rPr>
-        <w:t xml:space="preserve"> </w:t>
-      </w:r>
-      <w:proofErr w:type="spellStart"/>
-      <w:r>
-        <w:rPr>
-          <w:i/>
-          <w:iCs/>
-          <w:sz w:val="20"/>
-          <w:szCs w:val="20"/>
-        </w:rPr>
-        <w:t>exceeding</w:t>
-      </w:r>
-      <w:proofErr w:type="spellEnd"/>
-      <w:r>
-        <w:rPr>
-          <w:i/>
-          <w:iCs/>
-          <w:sz w:val="20"/>
-          <w:szCs w:val="20"/>
-        </w:rPr>
-        <w:t xml:space="preserve"> the </w:t>
-      </w:r>
-      <w:proofErr w:type="spellStart"/>
-      <w:r>
-        <w:rPr>
-          <w:i/>
-          <w:iCs/>
-          <w:sz w:val="20"/>
-          <w:szCs w:val="20"/>
-        </w:rPr>
-        <w:t>null</w:t>
-      </w:r>
-      <w:proofErr w:type="spellEnd"/>
-      <w:r>
-        <w:rPr>
-          <w:i/>
-          <w:iCs/>
-          <w:sz w:val="20"/>
-          <w:szCs w:val="20"/>
-        </w:rPr>
-        <w:t xml:space="preserve"> 95th percentile.</w:t>
+      <w:r>
+        <w:t>Detection power = fraction of causal JSD values exceeding the null 95th percentile. Kimi values reflect the recovered rerun merged into the original study set.</w:t>
       </w:r>
     </w:p>
     <w:p>
@@ -21316,279 +19632,7 @@
         <w:jc w:val="both"/>
       </w:pPr>
       <w:r>
-        <w:t xml:space="preserve">Kimi K2.5 </w:t>
-      </w:r>
-      <w:proofErr w:type="spellStart"/>
-      <w:r>
-        <w:t>achieved</w:t>
-      </w:r>
-      <w:proofErr w:type="spellEnd"/>
-      <w:r>
-        <w:t xml:space="preserve"> an SNR of 2.16, </w:t>
-      </w:r>
-      <w:proofErr w:type="spellStart"/>
-      <w:r>
-        <w:t>indicating</w:t>
-      </w:r>
-      <w:proofErr w:type="spellEnd"/>
-      <w:r>
-        <w:t xml:space="preserve"> </w:t>
-      </w:r>
-      <w:proofErr w:type="spellStart"/>
-      <w:r>
-        <w:t>that</w:t>
-      </w:r>
-      <w:proofErr w:type="spellEnd"/>
-      <w:r>
-        <w:t xml:space="preserve"> </w:t>
-      </w:r>
-      <w:proofErr w:type="spellStart"/>
-      <w:r>
-        <w:t>its</w:t>
-      </w:r>
-      <w:proofErr w:type="spellEnd"/>
-      <w:r>
-        <w:t xml:space="preserve"> </w:t>
-      </w:r>
-      <w:proofErr w:type="spellStart"/>
-      <w:r>
-        <w:t>causal</w:t>
-      </w:r>
-      <w:proofErr w:type="spellEnd"/>
-      <w:r>
-        <w:t xml:space="preserve"> </w:t>
-      </w:r>
-      <w:proofErr w:type="spellStart"/>
-      <w:r>
-        <w:t>perturbation</w:t>
-      </w:r>
-      <w:proofErr w:type="spellEnd"/>
-      <w:r>
-        <w:t xml:space="preserve"> </w:t>
-      </w:r>
-      <w:proofErr w:type="spellStart"/>
-      <w:r>
-        <w:t>responses</w:t>
-      </w:r>
-      <w:proofErr w:type="spellEnd"/>
-      <w:r>
-        <w:t xml:space="preserve"> </w:t>
-      </w:r>
-      <w:proofErr w:type="spellStart"/>
-      <w:r>
-        <w:t>were</w:t>
-      </w:r>
-      <w:proofErr w:type="spellEnd"/>
-      <w:r>
-        <w:t xml:space="preserve"> </w:t>
-      </w:r>
-      <w:proofErr w:type="spellStart"/>
-      <w:r>
-        <w:t>approximately</w:t>
-      </w:r>
-      <w:proofErr w:type="spellEnd"/>
-      <w:r>
-        <w:t xml:space="preserve"> </w:t>
-      </w:r>
-      <w:proofErr w:type="spellStart"/>
-      <w:r>
-        <w:t>twice</w:t>
-      </w:r>
-      <w:proofErr w:type="spellEnd"/>
-      <w:r>
-        <w:t xml:space="preserve"> </w:t>
-      </w:r>
-      <w:proofErr w:type="spellStart"/>
-      <w:r>
-        <w:t>as</w:t>
-      </w:r>
-      <w:proofErr w:type="spellEnd"/>
-      <w:r>
-        <w:t xml:space="preserve"> strong </w:t>
-      </w:r>
-      <w:proofErr w:type="spellStart"/>
-      <w:r>
-        <w:t>as</w:t>
-      </w:r>
-      <w:proofErr w:type="spellEnd"/>
-      <w:r>
-        <w:t xml:space="preserve"> </w:t>
-      </w:r>
-      <w:proofErr w:type="spellStart"/>
-      <w:r>
-        <w:t>its</w:t>
-      </w:r>
-      <w:proofErr w:type="spellEnd"/>
-      <w:r>
-        <w:t xml:space="preserve"> </w:t>
-      </w:r>
-      <w:proofErr w:type="spellStart"/>
-      <w:r>
-        <w:t>noise-floor</w:t>
-      </w:r>
-      <w:proofErr w:type="spellEnd"/>
-      <w:r>
-        <w:t xml:space="preserve"> </w:t>
-      </w:r>
-      <w:proofErr w:type="spellStart"/>
-      <w:r>
-        <w:t>responses</w:t>
-      </w:r>
-      <w:proofErr w:type="spellEnd"/>
-      <w:r>
-        <w:t>—</w:t>
-      </w:r>
-      <w:proofErr w:type="spellStart"/>
-      <w:r>
-        <w:t>meaningful</w:t>
-      </w:r>
-      <w:proofErr w:type="spellEnd"/>
-      <w:r>
-        <w:t xml:space="preserve"> </w:t>
-      </w:r>
-      <w:proofErr w:type="spellStart"/>
-      <w:r>
-        <w:t>but</w:t>
-      </w:r>
-      <w:proofErr w:type="spellEnd"/>
-      <w:r>
-        <w:t xml:space="preserve"> </w:t>
-      </w:r>
-      <w:proofErr w:type="spellStart"/>
-      <w:r>
-        <w:t>below</w:t>
-      </w:r>
-      <w:proofErr w:type="spellEnd"/>
-      <w:r>
-        <w:t xml:space="preserve"> the </w:t>
-      </w:r>
-      <w:proofErr w:type="spellStart"/>
-      <w:r>
-        <w:t>threshold</w:t>
-      </w:r>
-      <w:proofErr w:type="spellEnd"/>
-      <w:r>
-        <w:t xml:space="preserve"> of 3.0 </w:t>
-      </w:r>
-      <w:proofErr w:type="spellStart"/>
-      <w:r>
-        <w:t>that</w:t>
-      </w:r>
-      <w:proofErr w:type="spellEnd"/>
-      <w:r>
-        <w:t xml:space="preserve"> </w:t>
-      </w:r>
-      <w:proofErr w:type="spellStart"/>
-      <w:r>
-        <w:t>would</w:t>
-      </w:r>
-      <w:proofErr w:type="spellEnd"/>
-      <w:r>
-        <w:t xml:space="preserve"> indicate </w:t>
-      </w:r>
-      <w:proofErr w:type="spellStart"/>
-      <w:r>
-        <w:t>reliable</w:t>
-      </w:r>
-      <w:proofErr w:type="spellEnd"/>
-      <w:r>
-        <w:t xml:space="preserve"> </w:t>
-      </w:r>
-      <w:proofErr w:type="spellStart"/>
-      <w:r>
-        <w:t>discrimination</w:t>
-      </w:r>
-      <w:proofErr w:type="spellEnd"/>
-      <w:r>
-        <w:t xml:space="preserve">. </w:t>
-      </w:r>
-      <w:proofErr w:type="spellStart"/>
-      <w:r>
-        <w:t>Its</w:t>
-      </w:r>
-      <w:proofErr w:type="spellEnd"/>
-      <w:r>
-        <w:t xml:space="preserve"> </w:t>
-      </w:r>
-      <w:proofErr w:type="spellStart"/>
-      <w:r>
-        <w:t>detection</w:t>
-      </w:r>
-      <w:proofErr w:type="spellEnd"/>
-      <w:r>
-        <w:t xml:space="preserve"> power of 15.0% </w:t>
-      </w:r>
-      <w:proofErr w:type="spellStart"/>
-      <w:r>
-        <w:t>means</w:t>
-      </w:r>
-      <w:proofErr w:type="spellEnd"/>
-      <w:r>
-        <w:t xml:space="preserve"> </w:t>
-      </w:r>
-      <w:proofErr w:type="spellStart"/>
-      <w:r>
-        <w:t>that</w:t>
-      </w:r>
-      <w:proofErr w:type="spellEnd"/>
-      <w:r>
-        <w:t xml:space="preserve"> </w:t>
-      </w:r>
-      <w:proofErr w:type="spellStart"/>
-      <w:r>
-        <w:t>only</w:t>
-      </w:r>
-      <w:proofErr w:type="spellEnd"/>
-      <w:r>
-        <w:t xml:space="preserve"> a </w:t>
-      </w:r>
-      <w:proofErr w:type="spellStart"/>
-      <w:r>
-        <w:t>minority</w:t>
-      </w:r>
-      <w:proofErr w:type="spellEnd"/>
-      <w:r>
-        <w:t xml:space="preserve"> of </w:t>
-      </w:r>
-      <w:proofErr w:type="spellStart"/>
-      <w:r>
-        <w:t>causal</w:t>
-      </w:r>
-      <w:proofErr w:type="spellEnd"/>
-      <w:r>
-        <w:t xml:space="preserve"> </w:t>
-      </w:r>
-      <w:proofErr w:type="spellStart"/>
-      <w:r>
-        <w:t>signals</w:t>
-      </w:r>
-      <w:proofErr w:type="spellEnd"/>
-      <w:r>
-        <w:t xml:space="preserve"> rose </w:t>
-      </w:r>
-      <w:proofErr w:type="spellStart"/>
-      <w:r>
-        <w:t>above</w:t>
-      </w:r>
-      <w:proofErr w:type="spellEnd"/>
-      <w:r>
-        <w:t xml:space="preserve"> the </w:t>
-      </w:r>
-      <w:proofErr w:type="spellStart"/>
-      <w:r>
-        <w:t>noise</w:t>
-      </w:r>
-      <w:proofErr w:type="spellEnd"/>
-      <w:r>
-        <w:t xml:space="preserve"> </w:t>
-      </w:r>
-      <w:proofErr w:type="spellStart"/>
-      <w:r>
-        <w:t>floor</w:t>
-      </w:r>
-      <w:proofErr w:type="spellEnd"/>
-      <w:r>
-        <w:t xml:space="preserve"> with high confidence.</w:t>
+        <w:t>Kimi K2.5 achieved an SNR of 2.95, indicating that its causal perturbation responses were nearly three times as strong as its noise-floor responses and approached the threshold of 3.0 that would indicate reliable discrimination. Its detection power of 28.5% means that more than one quarter of causal signals rose above the noise floor with high confidence.</w:t>
       </w:r>
     </w:p>
     <w:p>
@@ -22057,415 +20101,7 @@
         <w:jc w:val="both"/>
       </w:pPr>
       <w:r>
-        <w:t xml:space="preserve">Figure 3 </w:t>
-      </w:r>
-      <w:proofErr w:type="spellStart"/>
-      <w:r>
-        <w:t>presents</w:t>
-      </w:r>
-      <w:proofErr w:type="spellEnd"/>
-      <w:r>
-        <w:t xml:space="preserve"> a </w:t>
-      </w:r>
-      <w:proofErr w:type="spellStart"/>
-      <w:r>
-        <w:t>normalised</w:t>
-      </w:r>
-      <w:proofErr w:type="spellEnd"/>
-      <w:r>
-        <w:t xml:space="preserve"> </w:t>
-      </w:r>
-      <w:proofErr w:type="spellStart"/>
-      <w:r>
-        <w:t>summary</w:t>
-      </w:r>
-      <w:proofErr w:type="spellEnd"/>
-      <w:r>
-        <w:t xml:space="preserve"> of </w:t>
-      </w:r>
-      <w:proofErr w:type="spellStart"/>
-      <w:r>
-        <w:t>all</w:t>
-      </w:r>
-      <w:proofErr w:type="spellEnd"/>
-      <w:r>
-        <w:t xml:space="preserve"> </w:t>
-      </w:r>
-      <w:proofErr w:type="spellStart"/>
-      <w:r>
-        <w:t>three</w:t>
-      </w:r>
-      <w:proofErr w:type="spellEnd"/>
-      <w:r>
-        <w:t xml:space="preserve"> </w:t>
-      </w:r>
-      <w:proofErr w:type="spellStart"/>
-      <w:r>
-        <w:t>evaluation</w:t>
-      </w:r>
-      <w:proofErr w:type="spellEnd"/>
-      <w:r>
-        <w:t xml:space="preserve"> </w:t>
-      </w:r>
-      <w:proofErr w:type="spellStart"/>
-      <w:r>
-        <w:t>dimensions</w:t>
-      </w:r>
-      <w:proofErr w:type="spellEnd"/>
-      <w:r>
-        <w:t xml:space="preserve">. Kimi K2.5 </w:t>
-      </w:r>
-      <w:proofErr w:type="spellStart"/>
-      <w:r>
-        <w:t>substantially</w:t>
-      </w:r>
-      <w:proofErr w:type="spellEnd"/>
-      <w:r>
-        <w:t xml:space="preserve"> </w:t>
-      </w:r>
-      <w:proofErr w:type="spellStart"/>
-      <w:r>
-        <w:t>outperforms</w:t>
-      </w:r>
-      <w:proofErr w:type="spellEnd"/>
-      <w:r>
-        <w:t xml:space="preserve"> </w:t>
-      </w:r>
-      <w:proofErr w:type="spellStart"/>
-      <w:r>
-        <w:t>Llama</w:t>
-      </w:r>
-      <w:proofErr w:type="spellEnd"/>
-      <w:r>
-        <w:t xml:space="preserve"> 3.1-8B on </w:t>
-      </w:r>
-      <w:proofErr w:type="spellStart"/>
-      <w:r>
-        <w:t>every</w:t>
-      </w:r>
-      <w:proofErr w:type="spellEnd"/>
-      <w:r>
-        <w:t xml:space="preserve"> </w:t>
-      </w:r>
-      <w:proofErr w:type="spellStart"/>
-      <w:r>
-        <w:t>metric</w:t>
-      </w:r>
-      <w:proofErr w:type="spellEnd"/>
-      <w:r>
-        <w:t xml:space="preserve">, with the </w:t>
-      </w:r>
-      <w:proofErr w:type="spellStart"/>
-      <w:r>
-        <w:t>largest</w:t>
-      </w:r>
-      <w:proofErr w:type="spellEnd"/>
-      <w:r>
-        <w:t xml:space="preserve"> gap in Coverage (40.0% vs 7.3%) and </w:t>
-      </w:r>
-      <w:proofErr w:type="spellStart"/>
-      <w:r>
-        <w:t>Discriminability</w:t>
-      </w:r>
-      <w:proofErr w:type="spellEnd"/>
-      <w:r>
-        <w:t xml:space="preserve"> (SNR-</w:t>
-      </w:r>
-      <w:proofErr w:type="spellStart"/>
-      <w:r>
-        <w:t>derived</w:t>
-      </w:r>
-      <w:proofErr w:type="spellEnd"/>
-      <w:r>
-        <w:t xml:space="preserve"> score: 72.0% vs 15.3%). Fidelity shows a more </w:t>
-      </w:r>
-      <w:proofErr w:type="spellStart"/>
-      <w:r>
-        <w:t>nuanced</w:t>
-      </w:r>
-      <w:proofErr w:type="spellEnd"/>
-      <w:r>
-        <w:t xml:space="preserve"> picture: </w:t>
-      </w:r>
-      <w:proofErr w:type="spellStart"/>
-      <w:r>
-        <w:t>while</w:t>
-      </w:r>
-      <w:proofErr w:type="spellEnd"/>
-      <w:r>
-        <w:t xml:space="preserve"> </w:t>
-      </w:r>
-      <w:proofErr w:type="spellStart"/>
-      <w:r>
-        <w:t>direction</w:t>
-      </w:r>
-      <w:proofErr w:type="spellEnd"/>
-      <w:r>
-        <w:t xml:space="preserve"> </w:t>
-      </w:r>
-      <w:proofErr w:type="spellStart"/>
-      <w:r>
-        <w:t>accuracy</w:t>
-      </w:r>
-      <w:proofErr w:type="spellEnd"/>
-      <w:r>
-        <w:t xml:space="preserve"> </w:t>
-      </w:r>
-      <w:proofErr w:type="spellStart"/>
-      <w:r>
-        <w:t>strongly</w:t>
-      </w:r>
-      <w:proofErr w:type="spellEnd"/>
-      <w:r>
-        <w:t xml:space="preserve"> </w:t>
-      </w:r>
-      <w:proofErr w:type="spellStart"/>
-      <w:r>
-        <w:t>favours</w:t>
-      </w:r>
-      <w:proofErr w:type="spellEnd"/>
-      <w:r>
-        <w:t xml:space="preserve"> Kimi (81.8% vs 25.0%), the </w:t>
-      </w:r>
-      <w:proofErr w:type="spellStart"/>
-      <w:r>
-        <w:t>normalised</w:t>
-      </w:r>
-      <w:proofErr w:type="spellEnd"/>
-      <w:r>
-        <w:t xml:space="preserve"> SID </w:t>
-      </w:r>
-      <w:proofErr w:type="spellStart"/>
-      <w:r>
-        <w:t>difference</w:t>
-      </w:r>
-      <w:proofErr w:type="spellEnd"/>
-      <w:r>
-        <w:t xml:space="preserve"> </w:t>
-      </w:r>
-      <w:proofErr w:type="spellStart"/>
-      <w:r>
-        <w:t>is</w:t>
-      </w:r>
-      <w:proofErr w:type="spellEnd"/>
-      <w:r>
-        <w:t xml:space="preserve"> </w:t>
-      </w:r>
-      <w:proofErr w:type="spellStart"/>
-      <w:r>
-        <w:t>smaller</w:t>
-      </w:r>
-      <w:proofErr w:type="spellEnd"/>
-      <w:r>
-        <w:t xml:space="preserve"> (77.8% vs 71.4%), </w:t>
-      </w:r>
-      <w:proofErr w:type="spellStart"/>
-      <w:r>
-        <w:t>reflecting</w:t>
-      </w:r>
-      <w:proofErr w:type="spellEnd"/>
-      <w:r>
-        <w:t xml:space="preserve"> the </w:t>
-      </w:r>
-      <w:proofErr w:type="spellStart"/>
-      <w:r>
-        <w:t>fact</w:t>
-      </w:r>
-      <w:proofErr w:type="spellEnd"/>
-      <w:r>
-        <w:t xml:space="preserve"> </w:t>
-      </w:r>
-      <w:proofErr w:type="spellStart"/>
-      <w:r>
-        <w:t>that</w:t>
-      </w:r>
-      <w:proofErr w:type="spellEnd"/>
-      <w:r>
-        <w:t xml:space="preserve"> </w:t>
-      </w:r>
-      <w:proofErr w:type="spellStart"/>
-      <w:r>
-        <w:t>even</w:t>
-      </w:r>
-      <w:proofErr w:type="spellEnd"/>
-      <w:r>
-        <w:t xml:space="preserve"> Kimi </w:t>
-      </w:r>
-      <w:proofErr w:type="spellStart"/>
-      <w:r>
-        <w:t>fails</w:t>
-      </w:r>
-      <w:proofErr w:type="spellEnd"/>
-      <w:r>
-        <w:t xml:space="preserve"> to shift on </w:t>
-      </w:r>
-      <w:proofErr w:type="spellStart"/>
-      <w:r>
-        <w:t>many</w:t>
-      </w:r>
-      <w:proofErr w:type="spellEnd"/>
-      <w:r>
-        <w:t xml:space="preserve"> </w:t>
-      </w:r>
-      <w:proofErr w:type="spellStart"/>
-      <w:r>
-        <w:t>expected</w:t>
-      </w:r>
-      <w:proofErr w:type="spellEnd"/>
-      <w:r>
-        <w:t xml:space="preserve"> </w:t>
-      </w:r>
-      <w:proofErr w:type="spellStart"/>
-      <w:r>
-        <w:t>edges</w:t>
-      </w:r>
-      <w:proofErr w:type="spellEnd"/>
-      <w:r>
-        <w:t xml:space="preserve"> (28 </w:t>
-      </w:r>
-      <w:proofErr w:type="spellStart"/>
-      <w:r>
-        <w:t>no_shift_when_expected</w:t>
-      </w:r>
-      <w:proofErr w:type="spellEnd"/>
-      <w:r>
-        <w:t xml:space="preserve"> </w:t>
-      </w:r>
-      <w:proofErr w:type="spellStart"/>
-      <w:r>
-        <w:t>errors</w:t>
-      </w:r>
-      <w:proofErr w:type="spellEnd"/>
-      <w:r>
-        <w:t xml:space="preserve">). The overall pattern </w:t>
-      </w:r>
-      <w:proofErr w:type="spellStart"/>
-      <w:r>
-        <w:t>is</w:t>
-      </w:r>
-      <w:proofErr w:type="spellEnd"/>
-      <w:r>
-        <w:t xml:space="preserve"> </w:t>
-      </w:r>
-      <w:proofErr w:type="spellStart"/>
-      <w:r>
-        <w:t>consistent</w:t>
-      </w:r>
-      <w:proofErr w:type="spellEnd"/>
-      <w:r>
-        <w:t xml:space="preserve"> </w:t>
-      </w:r>
-      <w:proofErr w:type="spellStart"/>
-      <w:r>
-        <w:t>across</w:t>
-      </w:r>
-      <w:proofErr w:type="spellEnd"/>
-      <w:r>
-        <w:t xml:space="preserve"> </w:t>
-      </w:r>
-      <w:proofErr w:type="spellStart"/>
-      <w:r>
-        <w:t>all</w:t>
-      </w:r>
-      <w:proofErr w:type="spellEnd"/>
-      <w:r>
-        <w:t xml:space="preserve"> </w:t>
-      </w:r>
-      <w:proofErr w:type="spellStart"/>
-      <w:r>
-        <w:t>three</w:t>
-      </w:r>
-      <w:proofErr w:type="spellEnd"/>
-      <w:r>
-        <w:t xml:space="preserve"> </w:t>
-      </w:r>
-      <w:proofErr w:type="spellStart"/>
-      <w:r>
-        <w:t>dimensions</w:t>
-      </w:r>
-      <w:proofErr w:type="spellEnd"/>
-      <w:r>
-        <w:t xml:space="preserve">: Kimi </w:t>
-      </w:r>
-      <w:proofErr w:type="spellStart"/>
-      <w:r>
-        <w:t>possesses</w:t>
-      </w:r>
-      <w:proofErr w:type="spellEnd"/>
-      <w:r>
-        <w:t xml:space="preserve"> a </w:t>
-      </w:r>
-      <w:proofErr w:type="spellStart"/>
-      <w:r>
-        <w:t>partial</w:t>
-      </w:r>
-      <w:proofErr w:type="spellEnd"/>
-      <w:r>
-        <w:t xml:space="preserve"> </w:t>
-      </w:r>
-      <w:proofErr w:type="spellStart"/>
-      <w:r>
-        <w:t>but</w:t>
-      </w:r>
-      <w:proofErr w:type="spellEnd"/>
-      <w:r>
-        <w:t xml:space="preserve"> incomplete </w:t>
-      </w:r>
-      <w:proofErr w:type="spellStart"/>
-      <w:r>
-        <w:t>causal</w:t>
-      </w:r>
-      <w:proofErr w:type="spellEnd"/>
-      <w:r>
-        <w:t xml:space="preserve"> world model, </w:t>
-      </w:r>
-      <w:proofErr w:type="spellStart"/>
-      <w:r>
-        <w:t>while</w:t>
-      </w:r>
-      <w:proofErr w:type="spellEnd"/>
-      <w:r>
-        <w:t xml:space="preserve"> </w:t>
-      </w:r>
-      <w:proofErr w:type="spellStart"/>
-      <w:r>
-        <w:t>Llama</w:t>
-      </w:r>
-      <w:proofErr w:type="spellEnd"/>
-      <w:r>
-        <w:t xml:space="preserve"> shows no </w:t>
-      </w:r>
-      <w:proofErr w:type="spellStart"/>
-      <w:r>
-        <w:t>meaningful</w:t>
-      </w:r>
-      <w:proofErr w:type="spellEnd"/>
-      <w:r>
-        <w:t xml:space="preserve"> </w:t>
-      </w:r>
-      <w:proofErr w:type="spellStart"/>
-      <w:r>
-        <w:t>causal</w:t>
-      </w:r>
-      <w:proofErr w:type="spellEnd"/>
-      <w:r>
-        <w:t xml:space="preserve"> sensitivity </w:t>
-      </w:r>
-      <w:proofErr w:type="spellStart"/>
-      <w:r>
-        <w:t>above</w:t>
-      </w:r>
-      <w:proofErr w:type="spellEnd"/>
-      <w:r>
-        <w:t xml:space="preserve"> </w:t>
-      </w:r>
-      <w:proofErr w:type="spellStart"/>
-      <w:r>
-        <w:t>noise</w:t>
-      </w:r>
-      <w:proofErr w:type="spellEnd"/>
-      <w:r>
-        <w:t>.</w:t>
+        <w:t>Figure 3 presents a normalised summary of all three evaluation dimensions. Kimi K2.5 substantially outperforms Llama 3.1-8B in Coverage (74.5% vs 7.3%) and Discriminability (SNR-derived score: 98.3% vs 15.3%). Fidelity is more nuanced: Kimi has markedly better overall structural performance by SID (77.6% vs 71.4% when expressed as 1 − normalised SID), whereas Llama’s apparent 100.0% direction accuracy reflects only 4 soft-detected edges and therefore should not be interpreted as evidence of a coherent causal graph. The overall pattern remains consistent across all three dimensions: Kimi possesses a partial but incomplete causal world model, while Llama shows no meaningful causal sensitivity above noise.</w:t>
       </w:r>
     </w:p>
     <w:p>
@@ -23819,624 +21455,7 @@
         <w:jc w:val="both"/>
       </w:pPr>
       <w:r>
-        <w:lastRenderedPageBreak/>
-        <w:t xml:space="preserve">The </w:t>
-      </w:r>
-      <w:proofErr w:type="spellStart"/>
-      <w:r>
-        <w:t>two</w:t>
-      </w:r>
-      <w:proofErr w:type="spellEnd"/>
-      <w:r>
-        <w:t xml:space="preserve"> models illustrate </w:t>
-      </w:r>
-      <w:proofErr w:type="spellStart"/>
-      <w:r>
-        <w:t>contrasting</w:t>
-      </w:r>
-      <w:proofErr w:type="spellEnd"/>
-      <w:r>
-        <w:t xml:space="preserve"> </w:t>
-      </w:r>
-      <w:proofErr w:type="spellStart"/>
-      <w:r>
-        <w:t>profiles</w:t>
-      </w:r>
-      <w:proofErr w:type="spellEnd"/>
-      <w:r>
-        <w:t xml:space="preserve"> </w:t>
-      </w:r>
-      <w:proofErr w:type="spellStart"/>
-      <w:r>
-        <w:t>across</w:t>
-      </w:r>
-      <w:proofErr w:type="spellEnd"/>
-      <w:r>
-        <w:t xml:space="preserve"> </w:t>
-      </w:r>
-      <w:proofErr w:type="spellStart"/>
-      <w:r>
-        <w:t>all</w:t>
-      </w:r>
-      <w:proofErr w:type="spellEnd"/>
-      <w:r>
-        <w:t xml:space="preserve"> </w:t>
-      </w:r>
-      <w:proofErr w:type="spellStart"/>
-      <w:r>
-        <w:t>three</w:t>
-      </w:r>
-      <w:proofErr w:type="spellEnd"/>
-      <w:r>
-        <w:t xml:space="preserve"> </w:t>
-      </w:r>
-      <w:proofErr w:type="spellStart"/>
-      <w:r>
-        <w:t>dimensions</w:t>
-      </w:r>
-      <w:proofErr w:type="spellEnd"/>
-      <w:r>
-        <w:t xml:space="preserve">. Kimi K2.5 </w:t>
-      </w:r>
-      <w:proofErr w:type="spellStart"/>
-      <w:r>
-        <w:t>has</w:t>
-      </w:r>
-      <w:proofErr w:type="spellEnd"/>
-      <w:r>
-        <w:t xml:space="preserve"> a </w:t>
-      </w:r>
-      <w:proofErr w:type="spellStart"/>
-      <w:r>
-        <w:t>partial</w:t>
-      </w:r>
-      <w:proofErr w:type="spellEnd"/>
-      <w:r>
-        <w:t xml:space="preserve"> world model: 40% coverage with 82% </w:t>
-      </w:r>
-      <w:proofErr w:type="spellStart"/>
-      <w:r>
-        <w:t>direction</w:t>
-      </w:r>
-      <w:proofErr w:type="spellEnd"/>
-      <w:r>
-        <w:t xml:space="preserve"> </w:t>
-      </w:r>
-      <w:proofErr w:type="spellStart"/>
-      <w:r>
-        <w:t>accuracy</w:t>
-      </w:r>
-      <w:proofErr w:type="spellEnd"/>
-      <w:r>
-        <w:t xml:space="preserve">, SID of 22%, and SNR of 2.16. </w:t>
-      </w:r>
-      <w:proofErr w:type="spellStart"/>
-      <w:r>
-        <w:t>Its</w:t>
-      </w:r>
-      <w:proofErr w:type="spellEnd"/>
-      <w:r>
-        <w:t xml:space="preserve"> </w:t>
-      </w:r>
-      <w:proofErr w:type="spellStart"/>
-      <w:r>
-        <w:t>edge-level</w:t>
-      </w:r>
-      <w:proofErr w:type="spellEnd"/>
-      <w:r>
-        <w:t xml:space="preserve"> JSD </w:t>
-      </w:r>
-      <w:proofErr w:type="spellStart"/>
-      <w:r>
-        <w:t>analysis</w:t>
-      </w:r>
-      <w:proofErr w:type="spellEnd"/>
-      <w:r>
-        <w:t xml:space="preserve"> (Figure 2) shows </w:t>
-      </w:r>
-      <w:proofErr w:type="spellStart"/>
-      <w:r>
-        <w:t>consistent</w:t>
-      </w:r>
-      <w:proofErr w:type="spellEnd"/>
-      <w:r>
-        <w:t xml:space="preserve"> moderate-</w:t>
-      </w:r>
-      <w:proofErr w:type="spellStart"/>
-      <w:r>
-        <w:t>strength</w:t>
-      </w:r>
-      <w:proofErr w:type="spellEnd"/>
-      <w:r>
-        <w:t xml:space="preserve"> </w:t>
-      </w:r>
-      <w:proofErr w:type="spellStart"/>
-      <w:r>
-        <w:t>causal</w:t>
-      </w:r>
-      <w:proofErr w:type="spellEnd"/>
-      <w:r>
-        <w:t xml:space="preserve"> </w:t>
-      </w:r>
-      <w:proofErr w:type="spellStart"/>
-      <w:r>
-        <w:t>signals</w:t>
-      </w:r>
-      <w:proofErr w:type="spellEnd"/>
-      <w:r>
-        <w:t xml:space="preserve"> </w:t>
-      </w:r>
-      <w:proofErr w:type="spellStart"/>
-      <w:r>
-        <w:t>across</w:t>
-      </w:r>
-      <w:proofErr w:type="spellEnd"/>
-      <w:r>
-        <w:t xml:space="preserve"> the </w:t>
-      </w:r>
-      <w:proofErr w:type="spellStart"/>
-      <w:r>
-        <w:t>majority</w:t>
-      </w:r>
-      <w:proofErr w:type="spellEnd"/>
-      <w:r>
-        <w:t xml:space="preserve"> of </w:t>
-      </w:r>
-      <w:proofErr w:type="spellStart"/>
-      <w:r>
-        <w:t>edges</w:t>
-      </w:r>
-      <w:proofErr w:type="spellEnd"/>
-      <w:r>
-        <w:t xml:space="preserve">. </w:t>
-      </w:r>
-      <w:proofErr w:type="spellStart"/>
-      <w:r>
-        <w:t>Llama</w:t>
-      </w:r>
-      <w:proofErr w:type="spellEnd"/>
-      <w:r>
-        <w:t xml:space="preserve"> 3.1-8B, by </w:t>
-      </w:r>
-      <w:proofErr w:type="spellStart"/>
-      <w:r>
-        <w:t>contrast</w:t>
-      </w:r>
-      <w:proofErr w:type="spellEnd"/>
-      <w:r>
-        <w:t xml:space="preserve">, shows </w:t>
-      </w:r>
-      <w:proofErr w:type="spellStart"/>
-      <w:r>
-        <w:t>near-absent</w:t>
-      </w:r>
-      <w:proofErr w:type="spellEnd"/>
-      <w:r>
-        <w:t xml:space="preserve"> </w:t>
-      </w:r>
-      <w:proofErr w:type="spellStart"/>
-      <w:r>
-        <w:t>causal</w:t>
-      </w:r>
-      <w:proofErr w:type="spellEnd"/>
-      <w:r>
-        <w:t xml:space="preserve"> sensitivity: 7% coverage, 25% </w:t>
-      </w:r>
-      <w:proofErr w:type="spellStart"/>
-      <w:r>
-        <w:t>direction</w:t>
-      </w:r>
-      <w:proofErr w:type="spellEnd"/>
-      <w:r>
-        <w:t xml:space="preserve"> </w:t>
-      </w:r>
-      <w:proofErr w:type="spellStart"/>
-      <w:r>
-        <w:t>accuracy</w:t>
-      </w:r>
-      <w:proofErr w:type="spellEnd"/>
-      <w:r>
-        <w:t xml:space="preserve">, and a </w:t>
-      </w:r>
-      <w:proofErr w:type="spellStart"/>
-      <w:r>
-        <w:t>pathological</w:t>
-      </w:r>
-      <w:proofErr w:type="spellEnd"/>
-      <w:r>
-        <w:t xml:space="preserve"> SNR of 0.46, </w:t>
-      </w:r>
-      <w:proofErr w:type="spellStart"/>
-      <w:r>
-        <w:t>meaning</w:t>
-      </w:r>
-      <w:proofErr w:type="spellEnd"/>
-      <w:r>
-        <w:t xml:space="preserve"> </w:t>
-      </w:r>
-      <w:proofErr w:type="spellStart"/>
-      <w:r>
-        <w:t>it</w:t>
-      </w:r>
-      <w:proofErr w:type="spellEnd"/>
-      <w:r>
-        <w:t xml:space="preserve"> </w:t>
-      </w:r>
-      <w:proofErr w:type="spellStart"/>
-      <w:r>
-        <w:t>responds</w:t>
-      </w:r>
-      <w:proofErr w:type="spellEnd"/>
-      <w:r>
-        <w:t xml:space="preserve"> more to </w:t>
-      </w:r>
-      <w:proofErr w:type="spellStart"/>
-      <w:r>
-        <w:t>clinically</w:t>
-      </w:r>
-      <w:proofErr w:type="spellEnd"/>
-      <w:r>
-        <w:t xml:space="preserve"> </w:t>
-      </w:r>
-      <w:proofErr w:type="spellStart"/>
-      <w:r>
-        <w:t>irrelevant</w:t>
-      </w:r>
-      <w:proofErr w:type="spellEnd"/>
-      <w:r>
-        <w:t xml:space="preserve"> </w:t>
-      </w:r>
-      <w:proofErr w:type="spellStart"/>
-      <w:r>
-        <w:t>perturbations</w:t>
-      </w:r>
-      <w:proofErr w:type="spellEnd"/>
-      <w:r>
-        <w:t xml:space="preserve"> </w:t>
-      </w:r>
-      <w:proofErr w:type="spellStart"/>
-      <w:r>
-        <w:t>than</w:t>
-      </w:r>
-      <w:proofErr w:type="spellEnd"/>
-      <w:r>
-        <w:t xml:space="preserve"> to </w:t>
-      </w:r>
-      <w:proofErr w:type="spellStart"/>
-      <w:r>
-        <w:t>causally</w:t>
-      </w:r>
-      <w:proofErr w:type="spellEnd"/>
-      <w:r>
-        <w:t xml:space="preserve"> </w:t>
-      </w:r>
-      <w:proofErr w:type="spellStart"/>
-      <w:r>
-        <w:t>meaningful</w:t>
-      </w:r>
-      <w:proofErr w:type="spellEnd"/>
-      <w:r>
-        <w:t xml:space="preserve"> </w:t>
-      </w:r>
-      <w:proofErr w:type="spellStart"/>
-      <w:r>
-        <w:t>ones</w:t>
-      </w:r>
-      <w:proofErr w:type="spellEnd"/>
-      <w:r>
-        <w:t xml:space="preserve">. The </w:t>
-      </w:r>
-      <w:proofErr w:type="spellStart"/>
-      <w:r>
-        <w:t>edge-level</w:t>
-      </w:r>
-      <w:proofErr w:type="spellEnd"/>
-      <w:r>
-        <w:t xml:space="preserve"> </w:t>
-      </w:r>
-      <w:proofErr w:type="spellStart"/>
-      <w:r>
-        <w:t>analysis</w:t>
-      </w:r>
-      <w:proofErr w:type="spellEnd"/>
-      <w:r>
-        <w:t xml:space="preserve"> </w:t>
-      </w:r>
-      <w:proofErr w:type="spellStart"/>
-      <w:r>
-        <w:t>confirms</w:t>
-      </w:r>
-      <w:proofErr w:type="spellEnd"/>
-      <w:r>
-        <w:t xml:space="preserve"> </w:t>
-      </w:r>
-      <w:proofErr w:type="spellStart"/>
-      <w:r>
-        <w:t>this</w:t>
-      </w:r>
-      <w:proofErr w:type="spellEnd"/>
-      <w:r>
-        <w:t xml:space="preserve"> </w:t>
-      </w:r>
-      <w:proofErr w:type="spellStart"/>
-      <w:r>
-        <w:t>is</w:t>
-      </w:r>
-      <w:proofErr w:type="spellEnd"/>
-      <w:r>
-        <w:t xml:space="preserve"> </w:t>
-      </w:r>
-      <w:proofErr w:type="spellStart"/>
-      <w:r>
-        <w:t>not</w:t>
-      </w:r>
-      <w:proofErr w:type="spellEnd"/>
-      <w:r>
-        <w:t xml:space="preserve"> a </w:t>
-      </w:r>
-      <w:proofErr w:type="spellStart"/>
-      <w:r>
-        <w:t>statistical</w:t>
-      </w:r>
-      <w:proofErr w:type="spellEnd"/>
-      <w:r>
-        <w:t xml:space="preserve"> </w:t>
-      </w:r>
-      <w:proofErr w:type="spellStart"/>
-      <w:r>
-        <w:t>artefact</w:t>
-      </w:r>
-      <w:proofErr w:type="spellEnd"/>
-      <w:r>
-        <w:t>—</w:t>
-      </w:r>
-      <w:proofErr w:type="spellStart"/>
-      <w:r>
-        <w:t>Llama’s</w:t>
-      </w:r>
-      <w:proofErr w:type="spellEnd"/>
-      <w:r>
-        <w:t xml:space="preserve"> JSD </w:t>
-      </w:r>
-      <w:proofErr w:type="spellStart"/>
-      <w:r>
-        <w:t>values</w:t>
-      </w:r>
-      <w:proofErr w:type="spellEnd"/>
-      <w:r>
-        <w:t xml:space="preserve"> cluster </w:t>
-      </w:r>
-      <w:proofErr w:type="spellStart"/>
-      <w:r>
-        <w:t>near</w:t>
-      </w:r>
-      <w:proofErr w:type="spellEnd"/>
-      <w:r>
-        <w:t xml:space="preserve"> zero </w:t>
-      </w:r>
-      <w:proofErr w:type="spellStart"/>
-      <w:r>
-        <w:t>across</w:t>
-      </w:r>
-      <w:proofErr w:type="spellEnd"/>
-      <w:r>
-        <w:t xml:space="preserve"> </w:t>
-      </w:r>
-      <w:proofErr w:type="spellStart"/>
-      <w:r>
-        <w:t>virtually</w:t>
-      </w:r>
-      <w:proofErr w:type="spellEnd"/>
-      <w:r>
-        <w:t xml:space="preserve"> </w:t>
-      </w:r>
-      <w:proofErr w:type="spellStart"/>
-      <w:r>
-        <w:t>all</w:t>
-      </w:r>
-      <w:proofErr w:type="spellEnd"/>
-      <w:r>
-        <w:t xml:space="preserve"> 55 </w:t>
-      </w:r>
-      <w:proofErr w:type="spellStart"/>
-      <w:r>
-        <w:t>edges</w:t>
-      </w:r>
-      <w:proofErr w:type="spellEnd"/>
-      <w:r>
-        <w:t xml:space="preserve">. </w:t>
-      </w:r>
-      <w:proofErr w:type="spellStart"/>
-      <w:r>
-        <w:t>These</w:t>
-      </w:r>
-      <w:proofErr w:type="spellEnd"/>
-      <w:r>
-        <w:t xml:space="preserve"> </w:t>
-      </w:r>
-      <w:proofErr w:type="spellStart"/>
-      <w:r>
-        <w:t>profiles</w:t>
-      </w:r>
-      <w:proofErr w:type="spellEnd"/>
-      <w:r>
-        <w:t xml:space="preserve"> </w:t>
-      </w:r>
-      <w:proofErr w:type="spellStart"/>
-      <w:r>
-        <w:t>correspond</w:t>
-      </w:r>
-      <w:proofErr w:type="spellEnd"/>
-      <w:r>
-        <w:t xml:space="preserve"> </w:t>
-      </w:r>
-      <w:proofErr w:type="spellStart"/>
-      <w:r>
-        <w:t>roughly</w:t>
-      </w:r>
-      <w:proofErr w:type="spellEnd"/>
-      <w:r>
-        <w:t xml:space="preserve"> to a </w:t>
-      </w:r>
-      <w:proofErr w:type="spellStart"/>
-      <w:r>
-        <w:t>clinician</w:t>
-      </w:r>
-      <w:proofErr w:type="spellEnd"/>
-      <w:r>
-        <w:t xml:space="preserve"> </w:t>
-      </w:r>
-      <w:proofErr w:type="spellStart"/>
-      <w:r>
-        <w:t>who</w:t>
-      </w:r>
-      <w:proofErr w:type="spellEnd"/>
-      <w:r>
-        <w:t xml:space="preserve"> </w:t>
-      </w:r>
-      <w:proofErr w:type="spellStart"/>
-      <w:r>
-        <w:t>has</w:t>
-      </w:r>
-      <w:proofErr w:type="spellEnd"/>
-      <w:r>
-        <w:t xml:space="preserve"> </w:t>
-      </w:r>
-      <w:proofErr w:type="spellStart"/>
-      <w:r>
-        <w:t>grasped</w:t>
-      </w:r>
-      <w:proofErr w:type="spellEnd"/>
-      <w:r>
-        <w:t xml:space="preserve"> some </w:t>
-      </w:r>
-      <w:proofErr w:type="spellStart"/>
-      <w:r>
-        <w:t>causal</w:t>
-      </w:r>
-      <w:proofErr w:type="spellEnd"/>
-      <w:r>
-        <w:t xml:space="preserve"> </w:t>
-      </w:r>
-      <w:proofErr w:type="spellStart"/>
-      <w:r>
-        <w:t>principles</w:t>
-      </w:r>
-      <w:proofErr w:type="spellEnd"/>
-      <w:r>
-        <w:t xml:space="preserve"> </w:t>
-      </w:r>
-      <w:proofErr w:type="spellStart"/>
-      <w:r>
-        <w:t>but</w:t>
-      </w:r>
-      <w:proofErr w:type="spellEnd"/>
-      <w:r>
-        <w:t xml:space="preserve"> </w:t>
-      </w:r>
-      <w:proofErr w:type="spellStart"/>
-      <w:r>
-        <w:t>applies</w:t>
-      </w:r>
-      <w:proofErr w:type="spellEnd"/>
-      <w:r>
-        <w:t xml:space="preserve"> </w:t>
-      </w:r>
-      <w:proofErr w:type="spellStart"/>
-      <w:r>
-        <w:t>them</w:t>
-      </w:r>
-      <w:proofErr w:type="spellEnd"/>
-      <w:r>
-        <w:t xml:space="preserve"> </w:t>
-      </w:r>
-      <w:proofErr w:type="spellStart"/>
-      <w:r>
-        <w:t>inconsistently</w:t>
-      </w:r>
-      <w:proofErr w:type="spellEnd"/>
-      <w:r>
-        <w:t xml:space="preserve"> (Kimi) versus one </w:t>
-      </w:r>
-      <w:proofErr w:type="spellStart"/>
-      <w:r>
-        <w:t>who</w:t>
-      </w:r>
-      <w:proofErr w:type="spellEnd"/>
-      <w:r>
-        <w:t xml:space="preserve"> </w:t>
-      </w:r>
-      <w:proofErr w:type="spellStart"/>
-      <w:r>
-        <w:t>has</w:t>
-      </w:r>
-      <w:proofErr w:type="spellEnd"/>
-      <w:r>
-        <w:t xml:space="preserve"> </w:t>
-      </w:r>
-      <w:proofErr w:type="spellStart"/>
-      <w:r>
-        <w:t>memorised</w:t>
-      </w:r>
-      <w:proofErr w:type="spellEnd"/>
-      <w:r>
-        <w:t xml:space="preserve"> treatment </w:t>
-      </w:r>
-      <w:proofErr w:type="spellStart"/>
-      <w:r>
-        <w:t>protocols</w:t>
-      </w:r>
-      <w:proofErr w:type="spellEnd"/>
-      <w:r>
-        <w:t xml:space="preserve"> </w:t>
-      </w:r>
-      <w:proofErr w:type="spellStart"/>
-      <w:r>
-        <w:t>without</w:t>
-      </w:r>
-      <w:proofErr w:type="spellEnd"/>
-      <w:r>
-        <w:t xml:space="preserve"> </w:t>
-      </w:r>
-      <w:proofErr w:type="spellStart"/>
-      <w:r>
-        <w:t>understanding</w:t>
-      </w:r>
-      <w:proofErr w:type="spellEnd"/>
-      <w:r>
-        <w:t xml:space="preserve"> </w:t>
-      </w:r>
-      <w:proofErr w:type="spellStart"/>
-      <w:r>
-        <w:t>why</w:t>
-      </w:r>
-      <w:proofErr w:type="spellEnd"/>
-      <w:r>
-        <w:t xml:space="preserve"> </w:t>
-      </w:r>
-      <w:proofErr w:type="spellStart"/>
-      <w:r>
-        <w:t>they</w:t>
-      </w:r>
-      <w:proofErr w:type="spellEnd"/>
-      <w:r>
-        <w:t xml:space="preserve"> </w:t>
-      </w:r>
-      <w:proofErr w:type="spellStart"/>
-      <w:r>
-        <w:t>apply</w:t>
-      </w:r>
-      <w:proofErr w:type="spellEnd"/>
-      <w:r>
-        <w:t xml:space="preserve"> (</w:t>
-      </w:r>
-      <w:proofErr w:type="spellStart"/>
-      <w:r>
-        <w:t>Llama</w:t>
-      </w:r>
-      <w:proofErr w:type="spellEnd"/>
-      <w:r>
-        <w:t>).</w:t>
+        <w:t>The two models illustrate contrasting profiles across all three dimensions. Kimi K2.5 has a partial world model: 74.5% coverage, 70.0% direction accuracy, SID of 22.4%, and SNR of 2.95. Its edge-level JSD analysis (Figure 2) shows consistent moderate-strength causal signals across a large fraction of edges. Llama 3.1-8B, by contrast, shows near-absent causal sensitivity: 7.3% coverage and a pathological SNR of 0.46, meaning it responds more to clinically irrelevant perturbations than to causally meaningful ones. Although the few edges it does recover are directionally correct, its overall structural divergence remains high and its coverage remains near-zero. These profiles correspond roughly to a clinician who has grasped some causal principles but applies them inconsistently (Kimi) versus one who has memorised treatment protocols without understanding why they apply (Llama).</w:t>
       </w:r>
     </w:p>
     <w:p>
@@ -26853,391 +23872,7 @@
         <w:jc w:val="both"/>
       </w:pPr>
       <w:r>
-        <w:t xml:space="preserve">Large </w:t>
-      </w:r>
-      <w:proofErr w:type="spellStart"/>
-      <w:r>
-        <w:t>language</w:t>
-      </w:r>
-      <w:proofErr w:type="spellEnd"/>
-      <w:r>
-        <w:t xml:space="preserve"> models do </w:t>
-      </w:r>
-      <w:proofErr w:type="spellStart"/>
-      <w:r>
-        <w:t>not</w:t>
-      </w:r>
-      <w:proofErr w:type="spellEnd"/>
-      <w:r>
-        <w:t xml:space="preserve"> </w:t>
-      </w:r>
-      <w:proofErr w:type="spellStart"/>
-      <w:r>
-        <w:t>possess</w:t>
-      </w:r>
-      <w:proofErr w:type="spellEnd"/>
-      <w:r>
-        <w:t xml:space="preserve"> </w:t>
-      </w:r>
-      <w:proofErr w:type="spellStart"/>
-      <w:r>
-        <w:t>coherent</w:t>
-      </w:r>
-      <w:proofErr w:type="spellEnd"/>
-      <w:r>
-        <w:t xml:space="preserve"> </w:t>
-      </w:r>
-      <w:proofErr w:type="spellStart"/>
-      <w:r>
-        <w:t>causal</w:t>
-      </w:r>
-      <w:proofErr w:type="spellEnd"/>
-      <w:r>
-        <w:t xml:space="preserve"> world models for </w:t>
-      </w:r>
-      <w:proofErr w:type="spellStart"/>
-      <w:r>
-        <w:t>specialised</w:t>
-      </w:r>
-      <w:proofErr w:type="spellEnd"/>
-      <w:r>
-        <w:t xml:space="preserve"> clinical decision-making in head and neck </w:t>
-      </w:r>
-      <w:proofErr w:type="spellStart"/>
-      <w:r>
-        <w:t>cancer</w:t>
-      </w:r>
-      <w:proofErr w:type="spellEnd"/>
-      <w:r>
-        <w:t xml:space="preserve">. </w:t>
-      </w:r>
-      <w:proofErr w:type="spellStart"/>
-      <w:r>
-        <w:t>Behavioural</w:t>
-      </w:r>
-      <w:proofErr w:type="spellEnd"/>
-      <w:r>
-        <w:t xml:space="preserve"> </w:t>
-      </w:r>
-      <w:proofErr w:type="spellStart"/>
-      <w:r>
-        <w:t>causal</w:t>
-      </w:r>
-      <w:proofErr w:type="spellEnd"/>
-      <w:r>
-        <w:t xml:space="preserve"> </w:t>
-      </w:r>
-      <w:proofErr w:type="spellStart"/>
-      <w:r>
-        <w:t>discovery</w:t>
-      </w:r>
-      <w:proofErr w:type="spellEnd"/>
-      <w:r>
-        <w:t xml:space="preserve"> </w:t>
-      </w:r>
-      <w:proofErr w:type="spellStart"/>
-      <w:r>
-        <w:t>recovers</w:t>
-      </w:r>
-      <w:proofErr w:type="spellEnd"/>
-      <w:r>
-        <w:t xml:space="preserve"> </w:t>
-      </w:r>
-      <w:proofErr w:type="spellStart"/>
-      <w:r>
-        <w:t>implicit</w:t>
-      </w:r>
-      <w:proofErr w:type="spellEnd"/>
-      <w:r>
-        <w:t xml:space="preserve"> </w:t>
-      </w:r>
-      <w:proofErr w:type="spellStart"/>
-      <w:r>
-        <w:t>causal</w:t>
-      </w:r>
-      <w:proofErr w:type="spellEnd"/>
-      <w:r>
-        <w:t xml:space="preserve"> </w:t>
-      </w:r>
-      <w:proofErr w:type="spellStart"/>
-      <w:r>
-        <w:t>graphs</w:t>
-      </w:r>
-      <w:proofErr w:type="spellEnd"/>
-      <w:r>
-        <w:t xml:space="preserve"> </w:t>
-      </w:r>
-      <w:proofErr w:type="spellStart"/>
-      <w:r>
-        <w:t>that</w:t>
-      </w:r>
-      <w:proofErr w:type="spellEnd"/>
-      <w:r>
-        <w:t xml:space="preserve"> are sparse and </w:t>
-      </w:r>
-      <w:proofErr w:type="spellStart"/>
-      <w:r>
-        <w:t>partially</w:t>
-      </w:r>
-      <w:proofErr w:type="spellEnd"/>
-      <w:r>
-        <w:t xml:space="preserve"> accurate (Kimi K2.5: 40% coverage, 82% </w:t>
-      </w:r>
-      <w:proofErr w:type="spellStart"/>
-      <w:r>
-        <w:t>direction</w:t>
-      </w:r>
-      <w:proofErr w:type="spellEnd"/>
-      <w:r>
-        <w:t xml:space="preserve"> </w:t>
-      </w:r>
-      <w:proofErr w:type="spellStart"/>
-      <w:r>
-        <w:t>accuracy</w:t>
-      </w:r>
-      <w:proofErr w:type="spellEnd"/>
-      <w:r>
-        <w:t xml:space="preserve">, SNR 2.16) or </w:t>
-      </w:r>
-      <w:proofErr w:type="spellStart"/>
-      <w:r>
-        <w:t>effectively</w:t>
-      </w:r>
-      <w:proofErr w:type="spellEnd"/>
-      <w:r>
-        <w:t xml:space="preserve"> </w:t>
-      </w:r>
-      <w:proofErr w:type="spellStart"/>
-      <w:r>
-        <w:t>absent</w:t>
-      </w:r>
-      <w:proofErr w:type="spellEnd"/>
-      <w:r>
-        <w:t xml:space="preserve"> (</w:t>
-      </w:r>
-      <w:proofErr w:type="spellStart"/>
-      <w:r>
-        <w:t>Llama</w:t>
-      </w:r>
-      <w:proofErr w:type="spellEnd"/>
-      <w:r>
-        <w:t xml:space="preserve"> 3.1-8B: 7% coverage, </w:t>
-      </w:r>
-      <w:proofErr w:type="spellStart"/>
-      <w:r>
-        <w:t>pathological</w:t>
-      </w:r>
-      <w:proofErr w:type="spellEnd"/>
-      <w:r>
-        <w:t xml:space="preserve"> SNR 0.46, zero </w:t>
-      </w:r>
-      <w:proofErr w:type="spellStart"/>
-      <w:r>
-        <w:t>detection</w:t>
-      </w:r>
-      <w:proofErr w:type="spellEnd"/>
-      <w:r>
-        <w:t xml:space="preserve"> power). The </w:t>
-      </w:r>
-      <w:proofErr w:type="spellStart"/>
-      <w:r>
-        <w:t>three-dimensional</w:t>
-      </w:r>
-      <w:proofErr w:type="spellEnd"/>
-      <w:r>
-        <w:t xml:space="preserve"> </w:t>
-      </w:r>
-      <w:proofErr w:type="spellStart"/>
-      <w:r>
-        <w:t>evaluation</w:t>
-      </w:r>
-      <w:proofErr w:type="spellEnd"/>
-      <w:r>
-        <w:t xml:space="preserve"> framework </w:t>
-      </w:r>
-      <w:proofErr w:type="spellStart"/>
-      <w:r>
-        <w:t>introduced</w:t>
-      </w:r>
-      <w:proofErr w:type="spellEnd"/>
-      <w:r>
-        <w:t xml:space="preserve"> </w:t>
-      </w:r>
-      <w:proofErr w:type="spellStart"/>
-      <w:r>
-        <w:t>here</w:t>
-      </w:r>
-      <w:proofErr w:type="spellEnd"/>
-      <w:r>
-        <w:t xml:space="preserve">—Coverage, Fidelity, and </w:t>
-      </w:r>
-      <w:proofErr w:type="spellStart"/>
-      <w:r>
-        <w:t>Discriminability</w:t>
-      </w:r>
-      <w:proofErr w:type="spellEnd"/>
-      <w:r>
-        <w:t>—</w:t>
-      </w:r>
-      <w:proofErr w:type="spellStart"/>
-      <w:r>
-        <w:t>provides</w:t>
-      </w:r>
-      <w:proofErr w:type="spellEnd"/>
-      <w:r>
-        <w:t xml:space="preserve"> </w:t>
-      </w:r>
-      <w:proofErr w:type="spellStart"/>
-      <w:r>
-        <w:t>independently</w:t>
-      </w:r>
-      <w:proofErr w:type="spellEnd"/>
-      <w:r>
-        <w:t xml:space="preserve"> </w:t>
-      </w:r>
-      <w:proofErr w:type="spellStart"/>
-      <w:r>
-        <w:t>interpretable</w:t>
-      </w:r>
-      <w:proofErr w:type="spellEnd"/>
-      <w:r>
-        <w:t xml:space="preserve"> and </w:t>
-      </w:r>
-      <w:proofErr w:type="spellStart"/>
-      <w:r>
-        <w:t>graph-theoretically</w:t>
-      </w:r>
-      <w:proofErr w:type="spellEnd"/>
-      <w:r>
-        <w:t xml:space="preserve"> </w:t>
-      </w:r>
-      <w:proofErr w:type="spellStart"/>
-      <w:r>
-        <w:t>grounded</w:t>
-      </w:r>
-      <w:proofErr w:type="spellEnd"/>
-      <w:r>
-        <w:t xml:space="preserve"> </w:t>
-      </w:r>
-      <w:proofErr w:type="spellStart"/>
-      <w:r>
-        <w:t>diagnostics</w:t>
-      </w:r>
-      <w:proofErr w:type="spellEnd"/>
-      <w:r>
-        <w:t xml:space="preserve"> for </w:t>
-      </w:r>
-      <w:proofErr w:type="spellStart"/>
-      <w:r>
-        <w:t>determining</w:t>
-      </w:r>
-      <w:proofErr w:type="spellEnd"/>
-      <w:r>
-        <w:t xml:space="preserve"> </w:t>
-      </w:r>
-      <w:proofErr w:type="spellStart"/>
-      <w:r>
-        <w:t>whether</w:t>
-      </w:r>
-      <w:proofErr w:type="spellEnd"/>
-      <w:r>
-        <w:t xml:space="preserve"> an LLM </w:t>
-      </w:r>
-      <w:proofErr w:type="spellStart"/>
-      <w:r>
-        <w:t>has</w:t>
-      </w:r>
-      <w:proofErr w:type="spellEnd"/>
-      <w:r>
-        <w:t xml:space="preserve"> the </w:t>
-      </w:r>
-      <w:proofErr w:type="spellStart"/>
-      <w:r>
-        <w:t>causal</w:t>
-      </w:r>
-      <w:proofErr w:type="spellEnd"/>
-      <w:r>
-        <w:t xml:space="preserve"> </w:t>
-      </w:r>
-      <w:proofErr w:type="spellStart"/>
-      <w:r>
-        <w:t>understanding</w:t>
-      </w:r>
-      <w:proofErr w:type="spellEnd"/>
-      <w:r>
-        <w:t xml:space="preserve"> </w:t>
-      </w:r>
-      <w:proofErr w:type="spellStart"/>
-      <w:r>
-        <w:t>necessary</w:t>
-      </w:r>
-      <w:proofErr w:type="spellEnd"/>
-      <w:r>
-        <w:t xml:space="preserve"> for safe deployment in clinical practice. Benchmark </w:t>
-      </w:r>
-      <w:proofErr w:type="spellStart"/>
-      <w:r>
-        <w:t>accuracy</w:t>
-      </w:r>
-      <w:proofErr w:type="spellEnd"/>
-      <w:r>
-        <w:t xml:space="preserve"> </w:t>
-      </w:r>
-      <w:proofErr w:type="spellStart"/>
-      <w:r>
-        <w:t>without</w:t>
-      </w:r>
-      <w:proofErr w:type="spellEnd"/>
-      <w:r>
-        <w:t xml:space="preserve"> </w:t>
-      </w:r>
-      <w:proofErr w:type="spellStart"/>
-      <w:r>
-        <w:t>causal</w:t>
-      </w:r>
-      <w:proofErr w:type="spellEnd"/>
-      <w:r>
-        <w:t xml:space="preserve"> </w:t>
-      </w:r>
-      <w:proofErr w:type="spellStart"/>
-      <w:r>
-        <w:t>evaluation</w:t>
-      </w:r>
-      <w:proofErr w:type="spellEnd"/>
-      <w:r>
-        <w:t xml:space="preserve"> </w:t>
-      </w:r>
-      <w:proofErr w:type="spellStart"/>
-      <w:r>
-        <w:t>is</w:t>
-      </w:r>
-      <w:proofErr w:type="spellEnd"/>
-      <w:r>
-        <w:t xml:space="preserve"> </w:t>
-      </w:r>
-      <w:proofErr w:type="spellStart"/>
-      <w:r>
-        <w:t>insufficient</w:t>
-      </w:r>
-      <w:proofErr w:type="spellEnd"/>
-      <w:r>
-        <w:t xml:space="preserve"> </w:t>
-      </w:r>
-      <w:proofErr w:type="spellStart"/>
-      <w:r>
-        <w:t>evidence</w:t>
-      </w:r>
-      <w:proofErr w:type="spellEnd"/>
-      <w:r>
-        <w:t xml:space="preserve"> for clinical </w:t>
-      </w:r>
-      <w:proofErr w:type="spellStart"/>
-      <w:r>
-        <w:t>readiness</w:t>
-      </w:r>
-      <w:proofErr w:type="spellEnd"/>
-      <w:r>
-        <w:t>.</w:t>
+        <w:t>Large language models do not possess coherent causal world models for specialised clinical decision-making in head and neck cancer. Behavioural causal discovery recovers implicit causal graphs that are sparse but partially functional in Kimi K2.5 (74.5% coverage, 70.0% direction accuracy, SNR 2.95) and effectively absent in Llama 3.1-8B (7.3% coverage, pathological SNR 0.46, zero detection power). The three-dimensional evaluation framework introduced here, Coverage, Fidelity, and Discriminability, provides independently interpretable and graph-theoretically grounded diagnostics for determining whether an LLM has the causal understanding necessary for safe deployment in clinical practice. Benchmark accuracy without causal evaluation is insufficient evidence for clinical readiness.</w:t>
       </w:r>
     </w:p>
     <w:p>

</xml_diff>